<commit_message>
Update the ALNS-HCO paper draft document.
Co-authored-by: Cursor <cursoragent@cursor.com>
</commit_message>
<xml_diff>
--- a/ALNS-HCO-PAPER.docx
+++ b/ALNS-HCO-PAPER.docx
@@ -14,6 +14,17 @@
           <w:lang w:val="en-US"/>
         </w:rPr>
       </w:pPr>
+    </w:p>
+    <w:p>
+      <w:pPr>
+        <w:jc w:val="center"/>
+        <w:rPr>
+          <w:rFonts w:ascii="Times New Roman" w:hAnsi="Times New Roman" w:cs="Times New Roman"/>
+          <w:b/>
+          <w:bCs/>
+          <w:lang w:val="en-US"/>
+        </w:rPr>
+      </w:pPr>
       <w:r>
         <w:rPr>
           <w:rFonts w:ascii="Times New Roman" w:hAnsi="Times New Roman" w:cs="Times New Roman"/>
@@ -23,7 +34,7 @@
           <w:szCs w:val="32"/>
           <w:lang w:val="en-US"/>
         </w:rPr>
-        <w:t>Large-Scale EVRPTW with Partial Recharging and Heterogeneous Charging Using ALNS-HCO</w:t>
+        <w:t>Large-Scale Electric Vehicle Routing with Time Windows: Partial Recharging, Heterogeneous Charging Stations, and Charging-Aware Rerouting</w:t>
       </w:r>
     </w:p>
     <w:p>
@@ -35,28 +46,18 @@
           <w:lang w:val="en-US"/>
         </w:rPr>
       </w:pPr>
+      <w:r>
+        <w:rPr>
+          <w:rFonts w:ascii="Times New Roman" w:hAnsi="Times New Roman" w:cs="Times New Roman"/>
+          <w:b/>
+          <w:bCs/>
+          <w:lang w:val="en-US"/>
+        </w:rPr>
+        <w:t xml:space="preserve">Abstract </w:t>
+      </w:r>
     </w:p>
     <w:p>
       <w:pPr>
-        <w:rPr>
-          <w:rFonts w:ascii="Times New Roman" w:hAnsi="Times New Roman" w:cs="Times New Roman"/>
-          <w:b/>
-          <w:bCs/>
-          <w:lang w:val="en-US"/>
-        </w:rPr>
-      </w:pPr>
-      <w:r>
-        <w:rPr>
-          <w:rFonts w:ascii="Times New Roman" w:hAnsi="Times New Roman" w:cs="Times New Roman"/>
-          <w:b/>
-          <w:bCs/>
-          <w:lang w:val="en-US"/>
-        </w:rPr>
-        <w:t xml:space="preserve">Abstract </w:t>
-      </w:r>
-    </w:p>
-    <w:p>
-      <w:pPr>
         <w:jc w:val="both"/>
         <w:rPr>
           <w:rFonts w:ascii="Times New Roman" w:hAnsi="Times New Roman" w:cs="Times New Roman"/>
@@ -68,7 +69,7 @@
           <w:rFonts w:ascii="Times New Roman" w:hAnsi="Times New Roman" w:cs="Times New Roman"/>
           <w:lang w:val="en-US"/>
         </w:rPr>
-        <w:t xml:space="preserve">Electric </w:t>
+        <w:t xml:space="preserve">Electric vehicle </w:t>
       </w:r>
       <w:proofErr w:type="gramStart"/>
       <w:r>
@@ -76,6 +77,38 @@
           <w:rFonts w:ascii="Times New Roman" w:hAnsi="Times New Roman" w:cs="Times New Roman"/>
           <w:lang w:val="en-US"/>
         </w:rPr>
+        <w:t>routing</w:t>
+      </w:r>
+      <w:proofErr w:type="gramEnd"/>
+      <w:r>
+        <w:rPr>
+          <w:rFonts w:ascii="Times New Roman" w:hAnsi="Times New Roman" w:cs="Times New Roman"/>
+          <w:lang w:val="en-US"/>
+        </w:rPr>
+        <w:t xml:space="preserve"> becomes more complicated when customer time windows must be </w:t>
+      </w:r>
+      <w:proofErr w:type="gramStart"/>
+      <w:r>
+        <w:rPr>
+          <w:rFonts w:ascii="Times New Roman" w:hAnsi="Times New Roman" w:cs="Times New Roman"/>
+          <w:lang w:val="en-US"/>
+        </w:rPr>
+        <w:t>respected</w:t>
+      </w:r>
+      <w:proofErr w:type="gramEnd"/>
+      <w:r>
+        <w:rPr>
+          <w:rFonts w:ascii="Times New Roman" w:hAnsi="Times New Roman" w:cs="Times New Roman"/>
+          <w:lang w:val="en-US"/>
+        </w:rPr>
+        <w:t xml:space="preserve"> and vehicles also need to decide when and where to recharge. The problem becomes even more challenging when charging stations differ in electricity price, expected waiting time, and charging rate. This study investigates how these station differences, together with the amount of energy charged at each stop, affect large-scale electric </w:t>
+      </w:r>
+      <w:proofErr w:type="gramStart"/>
+      <w:r>
+        <w:rPr>
+          <w:rFonts w:ascii="Times New Roman" w:hAnsi="Times New Roman" w:cs="Times New Roman"/>
+          <w:lang w:val="en-US"/>
+        </w:rPr>
         <w:t>vehicle</w:t>
       </w:r>
       <w:proofErr w:type="gramEnd"/>
@@ -84,53 +117,7 @@
           <w:rFonts w:ascii="Times New Roman" w:hAnsi="Times New Roman" w:cs="Times New Roman"/>
           <w:lang w:val="en-US"/>
         </w:rPr>
-        <w:t xml:space="preserve"> routing with time windows becomes more complex when charging stations differ in charging rate, electricity price, and waiting time. This paper presents a two-phase Adaptive Large Neighborhood Search with a Heterogeneous Charging Oracle (ALNS-HCO) for large-scale electric vehicle routing with time windows. In Phase I, ALNS uses partial, just-enough-oriented recharging to construct a strong feasible routing solution and determine the fleet size. In Phase II, this fleet size is fixed while customer assignments and visit sequences may still change. The Heterogeneous Charging Oracle evaluates charging alternatives using expected electricity price, expected waiting time, charging rate, explicit partial charging quantities, and complete route feasibility. The method is evaluated on 120 Hanif benchmark instances with 1,000 customers under Original and Relaxed time windows. The experimental design separates three effects</w:t>
-      </w:r>
-      <w:r>
-        <w:rPr>
-          <w:rFonts w:ascii="Times New Roman" w:hAnsi="Times New Roman" w:cs="Times New Roman"/>
-          <w:lang w:val="en-US"/>
-        </w:rPr>
-        <w:t>,</w:t>
-      </w:r>
-      <w:r>
-        <w:rPr>
-          <w:rFonts w:ascii="Times New Roman" w:hAnsi="Times New Roman" w:cs="Times New Roman"/>
-          <w:lang w:val="en-US"/>
-        </w:rPr>
-        <w:t xml:space="preserve"> full versus partial recharging, detour-only versus heterogeneous station selection, and fixed-fleet Phase-II search with versus without HCO. Results show that partial recharging provides the largest and most consistent benefit, reducing charging expense by about 26.8% under </w:t>
-      </w:r>
-      <w:proofErr w:type="gramStart"/>
-      <w:r>
-        <w:rPr>
-          <w:rFonts w:ascii="Times New Roman" w:hAnsi="Times New Roman" w:cs="Times New Roman"/>
-          <w:lang w:val="en-US"/>
-        </w:rPr>
-        <w:t>Original</w:t>
-      </w:r>
-      <w:proofErr w:type="gramEnd"/>
-      <w:r>
-        <w:rPr>
-          <w:rFonts w:ascii="Times New Roman" w:hAnsi="Times New Roman" w:cs="Times New Roman"/>
-          <w:lang w:val="en-US"/>
-        </w:rPr>
-        <w:t xml:space="preserve"> time windows and 12.6% under Relaxed time windows, together with clear reductions in charged energy and charging time. Heterogeneous charging information provides smaller and more selective improvements. On identical fixed routes, it slightly reduces expected charging expense and station waiting under </w:t>
-      </w:r>
-      <w:proofErr w:type="gramStart"/>
-      <w:r>
-        <w:rPr>
-          <w:rFonts w:ascii="Times New Roman" w:hAnsi="Times New Roman" w:cs="Times New Roman"/>
-          <w:lang w:val="en-US"/>
-        </w:rPr>
-        <w:t>Original</w:t>
-      </w:r>
-      <w:proofErr w:type="gramEnd"/>
-      <w:r>
-        <w:rPr>
-          <w:rFonts w:ascii="Times New Roman" w:hAnsi="Times New Roman" w:cs="Times New Roman"/>
-          <w:lang w:val="en-US"/>
-        </w:rPr>
-        <w:t xml:space="preserve"> time windows, while the matched Phase-II analysis shows that larger gains are concentrated mainly in the C1 family. Under Relaxed time windows, the heterogeneous effect is weak or absent. Overall, the study shows that recharge quantity, station heterogeneity, and charging-aware rerouting should be evaluated separately when assessing large-scale electric vehicle routing methods.</w:t>
+        <w:t xml:space="preserve"> routing with time windows. To address this problem, we use a two-phase Adaptive Large Neighborhood Search framework with a Heterogeneous Charging Oracle. The first phase focuses on constructing feasible routes and determining the fleet size while allowing partial recharging. In the second phase, the fleet size remains fixed, while customer routes and charging decisions are further improved using information on station price, waiting time, and charging rate. The approach is tested on 120 large instances with 1,000 customers, covering clustered, random, and mixed customer distributions under both original and relaxed time windows. The experiments are designed to separate the effect of partial recharging from the effects of heterogeneous station selection and charging-aware rerouting. The results show that partial recharging has the largest and most consistent effect, reducing charging expense by about 26.8% under original time windows and 12.6% under relaxed time windows, while also reducing charged energy and charging time. The benefit of heterogeneous station information is smaller and depends more strongly on the structure of the instance. It is most noticeable under tighter time windows and in some instance families. Overall, the results show that charging quantity, station characteristics, and routing decisions affect solution performance in different ways and should therefore be examined separately.</w:t>
       </w:r>
     </w:p>
     <w:p>
@@ -2640,15 +2627,7 @@
                         <w:sz w:val="16"/>
                         <w:szCs w:val="16"/>
                       </w:rPr>
-                      <m:t>c</m:t>
-                    </m:r>
-                    <m:r>
-                      <w:rPr>
-                        <w:rFonts w:ascii="Cambria Math" w:hAnsi="Cambria Math" w:cs="Times New Roman"/>
-                        <w:sz w:val="16"/>
-                        <w:szCs w:val="16"/>
-                      </w:rPr>
-                      <m:t>h</m:t>
+                      <m:t>ch</m:t>
                     </m:r>
                   </m:sup>
                 </m:sSubSup>
@@ -2749,15 +2728,7 @@
                         <w:sz w:val="16"/>
                         <w:szCs w:val="16"/>
                       </w:rPr>
-                      <m:t>c</m:t>
-                    </m:r>
-                    <m:r>
-                      <w:rPr>
-                        <w:rFonts w:ascii="Cambria Math" w:hAnsi="Cambria Math" w:cs="Times New Roman"/>
-                        <w:sz w:val="16"/>
-                        <w:szCs w:val="16"/>
-                      </w:rPr>
-                      <m:t>h</m:t>
+                      <m:t>ch</m:t>
                     </m:r>
                   </m:sup>
                 </m:sSubSup>
@@ -3279,15 +3250,7 @@
                         <w:sz w:val="16"/>
                         <w:szCs w:val="16"/>
                       </w:rPr>
-                      <m:t>c</m:t>
-                    </m:r>
-                    <m:r>
-                      <w:rPr>
-                        <w:rFonts w:ascii="Cambria Math" w:hAnsi="Cambria Math" w:cs="Times New Roman"/>
-                        <w:sz w:val="16"/>
-                        <w:szCs w:val="16"/>
-                      </w:rPr>
-                      <m:t>h</m:t>
+                      <m:t>ch</m:t>
                     </m:r>
                   </m:sub>
                 </m:sSub>
@@ -4166,15 +4129,7 @@
                         <w:sz w:val="16"/>
                         <w:szCs w:val="16"/>
                       </w:rPr>
-                      <m:t>c</m:t>
-                    </m:r>
-                    <m:r>
-                      <w:rPr>
-                        <w:rFonts w:ascii="Cambria Math" w:hAnsi="Cambria Math" w:cs="Times New Roman"/>
-                        <w:sz w:val="16"/>
-                        <w:szCs w:val="16"/>
-                      </w:rPr>
-                      <m:t>h</m:t>
+                      <m:t>ch</m:t>
                     </m:r>
                   </m:sub>
                 </m:sSub>
@@ -4255,15 +4210,7 @@
                         <w:sz w:val="16"/>
                         <w:szCs w:val="16"/>
                       </w:rPr>
-                      <m:t>c</m:t>
-                    </m:r>
-                    <m:r>
-                      <w:rPr>
-                        <w:rFonts w:ascii="Cambria Math" w:hAnsi="Cambria Math" w:cs="Times New Roman"/>
-                        <w:sz w:val="16"/>
-                        <w:szCs w:val="16"/>
-                      </w:rPr>
-                      <m:t>h</m:t>
+                      <m:t>ch</m:t>
                     </m:r>
                   </m:sub>
                 </m:sSub>
@@ -4451,15 +4398,7 @@
                         <w:sz w:val="16"/>
                         <w:szCs w:val="16"/>
                       </w:rPr>
-                      <m:t>c</m:t>
-                    </m:r>
-                    <m:r>
-                      <w:rPr>
-                        <w:rFonts w:ascii="Cambria Math" w:hAnsi="Cambria Math" w:cs="Times New Roman"/>
-                        <w:sz w:val="16"/>
-                        <w:szCs w:val="16"/>
-                      </w:rPr>
-                      <m:t>h</m:t>
+                      <m:t>ch</m:t>
                     </m:r>
                   </m:sub>
                 </m:sSub>
@@ -4556,15 +4495,7 @@
                         <w:sz w:val="16"/>
                         <w:szCs w:val="16"/>
                       </w:rPr>
-                      <m:t>c</m:t>
-                    </m:r>
-                    <m:r>
-                      <w:rPr>
-                        <w:rFonts w:ascii="Cambria Math" w:hAnsi="Cambria Math" w:cs="Times New Roman"/>
-                        <w:sz w:val="16"/>
-                        <w:szCs w:val="16"/>
-                      </w:rPr>
-                      <m:t>h</m:t>
+                      <m:t>ch</m:t>
                     </m:r>
                   </m:sub>
                 </m:sSub>
@@ -5175,6 +5106,11 @@
     </w:p>
     <w:p>
       <w:pPr>
+        <w:pStyle w:val="Paragraphedeliste"/>
+        <w:numPr>
+          <w:ilvl w:val="0"/>
+          <w:numId w:val="25"/>
+        </w:numPr>
         <w:rPr>
           <w:rFonts w:ascii="Times New Roman" w:hAnsi="Times New Roman" w:cs="Times New Roman"/>
           <w:b/>
@@ -5260,7 +5196,7 @@
           <w:rFonts w:ascii="Times New Roman" w:hAnsi="Times New Roman" w:cs="Times New Roman"/>
           <w:lang w:val="en-US"/>
         </w:rPr>
-        <w:t xml:space="preserve"> is not only a way to restore battery feasibility, but also an operational decision that can directly affect route quality. More detailed models have also shown that simplified charging assumptions may lead to poor decisions. For example, nonlinear charging functions can change the amount of time required to reach a given battery level and therefore affect the feasibility and cost of a route [9]. Reviews of the EV routing literature confirm that </w:t>
+        <w:t xml:space="preserve"> is not only a way to restore battery feasibility, but also an operational decision that can directly affect route quality. More detailed models have also shown that simplified charging assumptions may lead to poor decisions. For example, nonlinear charging functions can change the amount of time required to reach a given battery level and therefore </w:t>
       </w:r>
       <w:r>
         <w:rPr>
@@ -5268,7 +5204,7 @@
           <w:lang w:val="en-US"/>
         </w:rPr>
         <w:lastRenderedPageBreak/>
-        <w:t>battery management, charging policy, energy consumption, and charging infrastructure have become central parts of modern EV routing models [14,18,19].</w:t>
+        <w:t>affect the feasibility and cost of a route [9]. Reviews of the EV routing literature confirm that battery management, charging policy, energy consumption, and charging infrastructure have become central parts of modern EV routing models [14,18,19].</w:t>
       </w:r>
     </w:p>
     <w:p>
@@ -5314,7 +5250,7 @@
           <w:rFonts w:ascii="Times New Roman" w:hAnsi="Times New Roman" w:cs="Times New Roman"/>
           <w:lang w:val="en-US"/>
         </w:rPr>
-        <w:t xml:space="preserve">This paper studies this problem through ALNS-HCO, an ALNS-based framework with a Heterogeneous Charging Oracle for large EVRPTW instances with heterogeneous charging stations. The study uses a benchmark containing 120 instances with 1,000 customers each, built from clustered, random, and mixed customer distributions and provided under both original and relaxed time-window settings [17]. Charging stations in this benchmark differ in charging rate </w:t>
+        <w:t xml:space="preserve">This paper studies this problem through ALNS-HCO, an ALNS-based framework with a Heterogeneous Charging Oracle for large EVRPTW instances with heterogeneous charging stations. The study uses a benchmark containing 120 instances with 1,000 customers each, built from clustered, random, and mixed customer distributions and provided under both original and </w:t>
       </w:r>
       <w:r>
         <w:rPr>
@@ -5322,7 +5258,7 @@
           <w:lang w:val="en-US"/>
         </w:rPr>
         <w:lastRenderedPageBreak/>
-        <w:t xml:space="preserve">and are also described by parameters for charging price and waiting time, which makes it possible to study routing and charging decisions under controlled station heterogeneity [17]. The proposed framework contains two connected phases. In the first phase, ALNS searches for feasible and high-quality customer routes while using partial, just-enough charging instead of forcing vehicles to return to full battery at every charging stop. This phase determines the fleet size and provides the main routing solution. The fleet size is then fixed. In the second phase, the search continues with the Heterogeneous Charging Oracle, which evaluates charging decisions using the expected electricity price, expected waiting time, charging rate, and energy required at each station. Customer assignments and sequences may still be adjusted during this phase, but the established fleet size is preserved, allowing the method to study whether charging-aware routing can improve operating conditions without requiring additional vehicles. The main contribution is therefore not the introduction of ALNS, partial charging, or heterogeneous charging stations individually, since </w:t>
+        <w:t xml:space="preserve">relaxed time-window settings [17]. Charging stations in this benchmark differ in charging rate and are also described by parameters for charging price and waiting time, which makes it possible to study routing and charging decisions under controlled station heterogeneity [17]. The proposed framework contains two connected phases. In the first phase, ALNS searches for feasible and high-quality customer routes while using partial, just-enough charging instead of forcing vehicles to return to full battery at every charging stop. This phase determines the fleet size and provides the main routing solution. The fleet size is then fixed. In the second phase, the search continues with the Heterogeneous Charging Oracle, which evaluates charging decisions using the expected electricity price, expected waiting time, charging rate, and energy required at each station. Customer assignments and sequences may still be adjusted during this phase, but the established fleet size is preserved, allowing the method to study whether charging-aware routing can improve operating conditions without requiring additional vehicles. The main contribution is therefore not the introduction of ALNS, partial charging, or heterogeneous charging stations individually, since </w:t>
       </w:r>
       <w:proofErr w:type="gramStart"/>
       <w:r>
@@ -5357,6 +5293,11 @@
     </w:p>
     <w:p>
       <w:pPr>
+        <w:pStyle w:val="Paragraphedeliste"/>
+        <w:numPr>
+          <w:ilvl w:val="0"/>
+          <w:numId w:val="25"/>
+        </w:numPr>
         <w:jc w:val="both"/>
         <w:rPr>
           <w:rFonts w:ascii="Times New Roman" w:hAnsi="Times New Roman" w:cs="Times New Roman"/>
@@ -5372,7 +5313,7 @@
           <w:bCs/>
           <w:lang w:val="en-US"/>
         </w:rPr>
-        <w:t>2. Related Work</w:t>
+        <w:t>Related Work</w:t>
       </w:r>
     </w:p>
     <w:p>
@@ -5404,7 +5345,7 @@
           <w:rFonts w:ascii="Times New Roman" w:hAnsi="Times New Roman" w:cs="Times New Roman"/>
           <w:lang w:val="en-US"/>
         </w:rPr>
-        <w:t>More detailed charging and energy models have also been proposed. Nonlinear charging functions account for the fact that charging speed may change with the battery state [9]. Other studies have examined vehicle scheduling, uncertain energy consumption, and the effects of traffic, payload, road conditions, and driving behavior on energy use [26,27,31]. Charging-</w:t>
+        <w:t xml:space="preserve">More detailed charging and energy models have also been proposed. Nonlinear charging functions account for the fact that charging speed may change with the battery state [9]. Other studies have examined vehicle scheduling, uncertain energy consumption, and the effects of </w:t>
       </w:r>
       <w:r>
         <w:rPr>
@@ -5412,7 +5353,7 @@
           <w:lang w:val="en-US"/>
         </w:rPr>
         <w:lastRenderedPageBreak/>
-        <w:t>station location has also been integrated with routing decisions [32,33]. These richer models provide a more realistic description of electric-vehicle operations, but they also increase computational difficulty, particularly when charging decisions must be evaluated repeatedly for large customer sets.</w:t>
+        <w:t>traffic, payload, road conditions, and driving behavior on energy use [26,27,31]. Charging-station location has also been integrated with routing decisions [32,33]. These richer models provide a more realistic description of electric-vehicle operations, but they also increase computational difficulty, particularly when charging decisions must be evaluated repeatedly for large customer sets.</w:t>
       </w:r>
     </w:p>
     <w:p>
@@ -5603,6 +5544,7 @@
                 <w:sz w:val="18"/>
                 <w:szCs w:val="18"/>
               </w:rPr>
+              <w:lastRenderedPageBreak/>
               <w:t>Study</w:t>
             </w:r>
           </w:p>
@@ -5971,7 +5913,6 @@
                 <w:sz w:val="18"/>
                 <w:szCs w:val="18"/>
               </w:rPr>
-              <w:lastRenderedPageBreak/>
               <w:t>[2]</w:t>
             </w:r>
           </w:p>
@@ -8031,13 +7972,6 @@
           <w:lang w:val="en-US"/>
         </w:rPr>
       </w:pPr>
-      <w:r>
-        <w:rPr>
-          <w:rFonts w:ascii="Times New Roman" w:hAnsi="Times New Roman" w:cs="Times New Roman"/>
-          <w:lang w:val="en-US"/>
-        </w:rPr>
-        <w:t>Table 1 shows that partial charging, different charging technologies, charging cost, station waiting, and heterogeneous charging have all been studied previously. The contribution of this work is therefore not any of these elements individually. Instead, the study provides a controlled large-scale analysis on 120 Hanif instances with 1,000 customers [17]. Full and partial recharging are first compared under the same search budget. The effect of heterogeneous station information is then isolated by comparing a detour-only oracle with HCO-Heterogeneous on identical customer routes, while the contribution of HCO during Phase II is evaluated against a matched fixed-fleet search without HCO. This design makes it possible to distinguish improvements caused by recharge quantity, station selection, and customer-route restructuring.</w:t>
-      </w:r>
     </w:p>
     <w:p>
       <w:pPr>
@@ -8047,9 +7981,21 @@
           <w:lang w:val="en-US"/>
         </w:rPr>
       </w:pPr>
+      <w:r>
+        <w:rPr>
+          <w:rFonts w:ascii="Times New Roman" w:hAnsi="Times New Roman" w:cs="Times New Roman"/>
+          <w:lang w:val="en-US"/>
+        </w:rPr>
+        <w:t>Table 1 shows that partial charging, different charging technologies, charging cost, station waiting, and heterogeneous charging have all been studied previously. The contribution of this work is therefore not any of these elements individually. Instead, the study provides a controlled large-scale analysis on 120 Hanif instances with 1,000 customers [17]. Full and partial recharging are first compared under the same search budget. The effect of heterogeneous station information is then isolated by comparing a detour-only oracle with HCO-Heterogeneous on identical customer routes, while the contribution of HCO during Phase II is evaluated against a matched fixed-fleet search without HCO. This design makes it possible to distinguish improvements caused by recharge quantity, station selection, and customer-route restructuring.</w:t>
+      </w:r>
     </w:p>
     <w:p>
       <w:pPr>
+        <w:pStyle w:val="Paragraphedeliste"/>
+        <w:numPr>
+          <w:ilvl w:val="0"/>
+          <w:numId w:val="25"/>
+        </w:numPr>
         <w:jc w:val="both"/>
         <w:rPr>
           <w:rFonts w:ascii="Times New Roman" w:hAnsi="Times New Roman" w:cs="Times New Roman"/>
@@ -8070,6 +8016,11 @@
     </w:p>
     <w:p>
       <w:pPr>
+        <w:pStyle w:val="Paragraphedeliste"/>
+        <w:numPr>
+          <w:ilvl w:val="1"/>
+          <w:numId w:val="25"/>
+        </w:numPr>
         <w:jc w:val="both"/>
         <w:rPr>
           <w:rFonts w:ascii="Times New Roman" w:hAnsi="Times New Roman" w:cs="Times New Roman"/>
@@ -8242,6 +8193,13 @@
       </m:oMath>
       <w:r>
         <w:rPr>
+          <w:rFonts w:ascii="Times New Roman" w:eastAsiaTheme="minorEastAsia" w:hAnsi="Times New Roman" w:cs="Times New Roman"/>
+          <w:lang w:val="en-US"/>
+        </w:rPr>
+        <w:t xml:space="preserve"> </w:t>
+      </w:r>
+      <w:r>
+        <w:rPr>
           <w:rFonts w:ascii="Times New Roman" w:hAnsi="Times New Roman" w:cs="Times New Roman"/>
           <w:lang w:val="en-US"/>
         </w:rPr>
@@ -8342,6 +8300,13 @@
       </m:oMath>
       <w:r>
         <w:rPr>
+          <w:rFonts w:ascii="Times New Roman" w:eastAsiaTheme="minorEastAsia" w:hAnsi="Times New Roman" w:cs="Times New Roman"/>
+          <w:lang w:val="en-US"/>
+        </w:rPr>
+        <w:t xml:space="preserve"> </w:t>
+      </w:r>
+      <w:r>
+        <w:rPr>
           <w:rFonts w:ascii="Times New Roman" w:hAnsi="Times New Roman" w:cs="Times New Roman"/>
           <w:lang w:val="en-US"/>
         </w:rPr>
@@ -8379,6 +8344,13 @@
       </m:oMath>
       <w:r>
         <w:rPr>
+          <w:rFonts w:ascii="Times New Roman" w:eastAsiaTheme="minorEastAsia" w:hAnsi="Times New Roman" w:cs="Times New Roman"/>
+          <w:lang w:val="en-US"/>
+        </w:rPr>
+        <w:t xml:space="preserve"> </w:t>
+      </w:r>
+      <w:r>
+        <w:rPr>
           <w:rFonts w:ascii="Times New Roman" w:hAnsi="Times New Roman" w:cs="Times New Roman"/>
           <w:lang w:val="en-US"/>
         </w:rPr>
@@ -8435,6 +8407,7 @@
           <w:rFonts w:ascii="Times New Roman" w:hAnsi="Times New Roman" w:cs="Times New Roman"/>
           <w:lang w:val="en-US"/>
         </w:rPr>
+        <w:lastRenderedPageBreak/>
         <w:t xml:space="preserve">Each customer </w:t>
       </w:r>
       <m:oMath>
@@ -8460,6 +8433,13 @@
           <m:t>C</m:t>
         </m:r>
       </m:oMath>
+      <w:r>
+        <w:rPr>
+          <w:rFonts w:ascii="Times New Roman" w:eastAsiaTheme="minorEastAsia" w:hAnsi="Times New Roman" w:cs="Times New Roman"/>
+          <w:lang w:val="en-US"/>
+        </w:rPr>
+        <w:t xml:space="preserve"> </w:t>
+      </w:r>
       <w:r>
         <w:rPr>
           <w:rFonts w:ascii="Times New Roman" w:hAnsi="Times New Roman" w:cs="Times New Roman"/>
@@ -8695,15 +8675,7 @@
           <w:rFonts w:ascii="Times New Roman" w:hAnsi="Times New Roman" w:cs="Times New Roman"/>
           <w:lang w:val="en-US"/>
         </w:rPr>
-        <w:t xml:space="preserve">. </w:t>
-      </w:r>
-      <w:r>
-        <w:rPr>
-          <w:rFonts w:ascii="Times New Roman" w:hAnsi="Times New Roman" w:cs="Times New Roman"/>
-          <w:lang w:val="en-US"/>
-        </w:rPr>
-        <w:lastRenderedPageBreak/>
-        <w:t xml:space="preserve">Each vehicle has a load capacity </w:t>
+        <w:t xml:space="preserve">. Each vehicle has a load capacity </w:t>
       </w:r>
       <m:oMath>
         <m:r>
@@ -8772,6 +8744,13 @@
       </m:oMath>
       <w:r>
         <w:rPr>
+          <w:rFonts w:ascii="Times New Roman" w:eastAsiaTheme="minorEastAsia" w:hAnsi="Times New Roman" w:cs="Times New Roman"/>
+          <w:lang w:val="en-US"/>
+        </w:rPr>
+        <w:t xml:space="preserve"> </w:t>
+      </w:r>
+      <w:r>
+        <w:rPr>
           <w:rFonts w:ascii="Times New Roman" w:hAnsi="Times New Roman" w:cs="Times New Roman"/>
           <w:lang w:val="en-US"/>
         </w:rPr>
@@ -8807,6 +8786,13 @@
           </m:sup>
         </m:sSup>
       </m:oMath>
+      <w:r>
+        <w:rPr>
+          <w:rFonts w:ascii="Times New Roman" w:eastAsiaTheme="minorEastAsia" w:hAnsi="Times New Roman" w:cs="Times New Roman"/>
+          <w:lang w:val="en-US"/>
+        </w:rPr>
+        <w:t xml:space="preserve"> </w:t>
+      </w:r>
       <w:r>
         <w:rPr>
           <w:rFonts w:ascii="Times New Roman" w:hAnsi="Times New Roman" w:cs="Times New Roman"/>
@@ -8825,6 +8811,13 @@
       </m:oMath>
       <w:r>
         <w:rPr>
+          <w:rFonts w:ascii="Times New Roman" w:eastAsiaTheme="minorEastAsia" w:hAnsi="Times New Roman" w:cs="Times New Roman"/>
+          <w:lang w:val="en-US"/>
+        </w:rPr>
+        <w:t xml:space="preserve"> </w:t>
+      </w:r>
+      <w:r>
+        <w:rPr>
           <w:rFonts w:ascii="Times New Roman" w:hAnsi="Times New Roman" w:cs="Times New Roman"/>
           <w:lang w:val="en-US"/>
         </w:rPr>
@@ -8841,6 +8834,13 @@
       </m:oMath>
       <w:r>
         <w:rPr>
+          <w:rFonts w:ascii="Times New Roman" w:eastAsiaTheme="minorEastAsia" w:hAnsi="Times New Roman" w:cs="Times New Roman"/>
+          <w:lang w:val="en-US"/>
+        </w:rPr>
+        <w:t xml:space="preserve"> </w:t>
+      </w:r>
+      <w:r>
+        <w:rPr>
           <w:rFonts w:ascii="Times New Roman" w:hAnsi="Times New Roman" w:cs="Times New Roman"/>
           <w:lang w:val="en-US"/>
         </w:rPr>
@@ -8855,6 +8855,13 @@
           <m:t>j</m:t>
         </m:r>
       </m:oMath>
+      <w:r>
+        <w:rPr>
+          <w:rFonts w:ascii="Times New Roman" w:eastAsiaTheme="minorEastAsia" w:hAnsi="Times New Roman" w:cs="Times New Roman"/>
+          <w:lang w:val="en-US"/>
+        </w:rPr>
+        <w:t xml:space="preserve"> </w:t>
+      </w:r>
       <w:r>
         <w:rPr>
           <w:rFonts w:ascii="Times New Roman" w:hAnsi="Times New Roman" w:cs="Times New Roman"/>
@@ -8970,7 +8977,7 @@
         <w:jc w:val="both"/>
         <w:rPr>
           <w:rFonts w:ascii="Times New Roman" w:hAnsi="Times New Roman" w:cs="Times New Roman"/>
-          <w:lang w:val="fr-MA"/>
+          <w:lang w:val="en-US"/>
         </w:rPr>
       </w:pPr>
       <w:r>
@@ -9010,6 +9017,13 @@
           </m:sub>
         </m:sSub>
       </m:oMath>
+      <w:r>
+        <w:rPr>
+          <w:rFonts w:ascii="Times New Roman" w:eastAsiaTheme="minorEastAsia" w:hAnsi="Times New Roman" w:cs="Times New Roman"/>
+          <w:lang w:val="en-US"/>
+        </w:rPr>
+        <w:t xml:space="preserve"> </w:t>
+      </w:r>
       <w:r>
         <w:rPr>
           <w:rFonts w:ascii="Times New Roman" w:hAnsi="Times New Roman" w:cs="Times New Roman"/>
@@ -9036,51 +9050,10 @@
       <w:r>
         <w:rPr>
           <w:rFonts w:ascii="Times New Roman" w:hAnsi="Times New Roman" w:cs="Times New Roman"/>
-          <w:lang w:val="fr-MA"/>
-        </w:rPr>
-        <w:t xml:space="preserve">The </w:t>
-      </w:r>
-      <w:proofErr w:type="spellStart"/>
-      <w:r>
-        <w:rPr>
-          <w:rFonts w:ascii="Times New Roman" w:hAnsi="Times New Roman" w:cs="Times New Roman"/>
-          <w:lang w:val="fr-MA"/>
-        </w:rPr>
-        <w:t>charging</w:t>
-      </w:r>
-      <w:proofErr w:type="spellEnd"/>
-      <w:r>
-        <w:rPr>
-          <w:rFonts w:ascii="Times New Roman" w:hAnsi="Times New Roman" w:cs="Times New Roman"/>
-          <w:lang w:val="fr-MA"/>
-        </w:rPr>
-        <w:t xml:space="preserve"> </w:t>
-      </w:r>
-      <w:proofErr w:type="spellStart"/>
-      <w:r>
-        <w:rPr>
-          <w:rFonts w:ascii="Times New Roman" w:hAnsi="Times New Roman" w:cs="Times New Roman"/>
-          <w:lang w:val="fr-MA"/>
-        </w:rPr>
-        <w:t>quantity</w:t>
-      </w:r>
-      <w:proofErr w:type="spellEnd"/>
-      <w:r>
-        <w:rPr>
-          <w:rFonts w:ascii="Times New Roman" w:hAnsi="Times New Roman" w:cs="Times New Roman"/>
-          <w:lang w:val="fr-MA"/>
-        </w:rPr>
-        <w:t xml:space="preserve"> </w:t>
-      </w:r>
-      <w:proofErr w:type="spellStart"/>
-      <w:r>
-        <w:rPr>
-          <w:rFonts w:ascii="Times New Roman" w:hAnsi="Times New Roman" w:cs="Times New Roman"/>
-          <w:lang w:val="fr-MA"/>
-        </w:rPr>
-        <w:t>satisfies</w:t>
-      </w:r>
-      <w:proofErr w:type="spellEnd"/>
+          <w:lang w:val="en-US"/>
+        </w:rPr>
+        <w:t>The charging quantity satisfies</w:t>
+      </w:r>
     </w:p>
     <w:p>
       <w:pPr>
@@ -9268,6 +9241,13 @@
       </m:oMath>
       <w:r>
         <w:rPr>
+          <w:rFonts w:ascii="Times New Roman" w:eastAsiaTheme="minorEastAsia" w:hAnsi="Times New Roman" w:cs="Times New Roman"/>
+          <w:lang w:val="en-US"/>
+        </w:rPr>
+        <w:t xml:space="preserve"> </w:t>
+      </w:r>
+      <w:r>
+        <w:rPr>
           <w:rFonts w:ascii="Times New Roman" w:hAnsi="Times New Roman" w:cs="Times New Roman"/>
           <w:lang w:val="en-US"/>
         </w:rPr>
@@ -9306,6 +9286,13 @@
           </m:sup>
         </m:sSup>
       </m:oMath>
+      <w:r>
+        <w:rPr>
+          <w:rFonts w:ascii="Times New Roman" w:eastAsiaTheme="minorEastAsia" w:hAnsi="Times New Roman" w:cs="Times New Roman"/>
+          <w:lang w:val="en-US"/>
+        </w:rPr>
+        <w:t xml:space="preserve"> </w:t>
+      </w:r>
       <w:r>
         <w:rPr>
           <w:rFonts w:ascii="Times New Roman" w:hAnsi="Times New Roman" w:cs="Times New Roman"/>
@@ -9352,6 +9339,13 @@
           <m:t>S</m:t>
         </m:r>
       </m:oMath>
+      <w:r>
+        <w:rPr>
+          <w:rFonts w:ascii="Times New Roman" w:eastAsiaTheme="minorEastAsia" w:hAnsi="Times New Roman" w:cs="Times New Roman"/>
+          <w:lang w:val="en-US"/>
+        </w:rPr>
+        <w:t xml:space="preserve"> </w:t>
+      </w:r>
       <w:r>
         <w:rPr>
           <w:rFonts w:ascii="Times New Roman" w:hAnsi="Times New Roman" w:cs="Times New Roman"/>
@@ -10123,14 +10117,7 @@
                   <w:rFonts w:ascii="Cambria Math" w:hAnsi="Cambria Math" w:cs="Times New Roman"/>
                   <w:lang w:val="fr-MA"/>
                 </w:rPr>
-                <m:t>c</m:t>
-              </m:r>
-              <m:r>
-                <w:rPr>
-                  <w:rFonts w:ascii="Cambria Math" w:hAnsi="Cambria Math" w:cs="Times New Roman"/>
-                  <w:lang w:val="fr-MA"/>
-                </w:rPr>
-                <m:t>h</m:t>
+                <m:t>ch</m:t>
               </m:r>
             </m:sup>
           </m:sSubSup>
@@ -10273,14 +10260,7 @@
                   <w:rFonts w:ascii="Cambria Math" w:hAnsi="Cambria Math" w:cs="Times New Roman"/>
                   <w:lang w:val="fr-MA"/>
                 </w:rPr>
-                <m:t>c</m:t>
-              </m:r>
-              <m:r>
-                <w:rPr>
-                  <w:rFonts w:ascii="Cambria Math" w:hAnsi="Cambria Math" w:cs="Times New Roman"/>
-                  <w:lang w:val="fr-MA"/>
-                </w:rPr>
-                <m:t>h</m:t>
+                <m:t>ch</m:t>
               </m:r>
             </m:sup>
           </m:sSubSup>
@@ -10376,6 +10356,7 @@
           <w:rFonts w:ascii="Times New Roman" w:hAnsi="Times New Roman" w:cs="Times New Roman"/>
           <w:lang w:val="en-US"/>
         </w:rPr>
+        <w:lastRenderedPageBreak/>
         <w:t>The total time associated with the charging visit is therefore</w:t>
       </w:r>
     </w:p>
@@ -10739,6 +10720,11 @@
     </w:p>
     <w:p>
       <w:pPr>
+        <w:pStyle w:val="Paragraphedeliste"/>
+        <w:numPr>
+          <w:ilvl w:val="1"/>
+          <w:numId w:val="25"/>
+        </w:numPr>
         <w:jc w:val="both"/>
         <w:rPr>
           <w:rFonts w:ascii="Times New Roman" w:hAnsi="Times New Roman" w:cs="Times New Roman"/>
@@ -11033,6 +11019,13 @@
       </m:oMath>
       <w:r>
         <w:rPr>
+          <w:rFonts w:ascii="Times New Roman" w:eastAsiaTheme="minorEastAsia" w:hAnsi="Times New Roman" w:cs="Times New Roman"/>
+          <w:lang w:val="en-US"/>
+        </w:rPr>
+        <w:t xml:space="preserve"> </w:t>
+      </w:r>
+      <w:r>
+        <w:rPr>
           <w:rFonts w:ascii="Times New Roman" w:hAnsi="Times New Roman" w:cs="Times New Roman"/>
           <w:lang w:val="en-US"/>
         </w:rPr>
@@ -11125,35 +11118,7 @@
                   <w:rFonts w:ascii="Cambria Math" w:hAnsi="Cambria Math" w:cs="Times New Roman"/>
                   <w:lang w:val="fr-MA"/>
                 </w:rPr>
-                <m:t>i</m:t>
-              </m:r>
-              <m:r>
-                <w:rPr>
-                  <w:rFonts w:ascii="Cambria Math" w:hAnsi="Cambria Math" w:cs="Times New Roman"/>
-                  <w:lang w:val="fr-MA"/>
-                </w:rPr>
-                <m:t>∈</m:t>
-              </m:r>
-              <m:r>
-                <w:rPr>
-                  <w:rFonts w:ascii="Cambria Math" w:hAnsi="Cambria Math" w:cs="Times New Roman"/>
-                  <w:lang w:val="fr-MA"/>
-                </w:rPr>
-                <m:t>C</m:t>
-              </m:r>
-              <m:r>
-                <w:rPr>
-                  <w:rFonts w:ascii="Cambria Math" w:hAnsi="Cambria Math" w:cs="Times New Roman"/>
-                  <w:lang w:val="fr-MA"/>
-                </w:rPr>
-                <m:t>∩</m:t>
-              </m:r>
-              <m:r>
-                <w:rPr>
-                  <w:rFonts w:ascii="Cambria Math" w:hAnsi="Cambria Math" w:cs="Times New Roman"/>
-                  <w:lang w:val="fr-MA"/>
-                </w:rPr>
-                <m:t>R</m:t>
+                <m:t>i∈C∩R</m:t>
               </m:r>
             </m:sub>
             <m:sup/>
@@ -11193,14 +11158,7 @@
               <w:rFonts w:ascii="Cambria Math" w:hAnsi="Cambria Math" w:cs="Times New Roman"/>
               <w:lang w:val="fr-MA"/>
             </w:rPr>
-            <m:t>≤</m:t>
-          </m:r>
-          <m:r>
-            <w:rPr>
-              <w:rFonts w:ascii="Cambria Math" w:hAnsi="Cambria Math" w:cs="Times New Roman"/>
-              <w:lang w:val="fr-MA"/>
-            </w:rPr>
-            <m:t>Q</m:t>
+            <m:t>≤Q</m:t>
           </m:r>
         </m:oMath>
       </m:oMathPara>
@@ -11340,6 +11298,13 @@
           <m:t>i</m:t>
         </m:r>
       </m:oMath>
+      <w:r>
+        <w:rPr>
+          <w:rFonts w:ascii="Times New Roman" w:eastAsiaTheme="minorEastAsia" w:hAnsi="Times New Roman" w:cs="Times New Roman"/>
+          <w:lang w:val="fr-MA"/>
+        </w:rPr>
+        <w:t xml:space="preserve"> </w:t>
+      </w:r>
       <w:r>
         <w:rPr>
           <w:rFonts w:ascii="Times New Roman" w:hAnsi="Times New Roman" w:cs="Times New Roman"/>
@@ -11499,6 +11464,13 @@
           <m:t>j</m:t>
         </m:r>
       </m:oMath>
+      <w:r>
+        <w:rPr>
+          <w:rFonts w:ascii="Times New Roman" w:eastAsiaTheme="minorEastAsia" w:hAnsi="Times New Roman" w:cs="Times New Roman"/>
+          <w:lang w:val="en-US"/>
+        </w:rPr>
+        <w:t xml:space="preserve"> </w:t>
+      </w:r>
       <w:r>
         <w:rPr>
           <w:rFonts w:ascii="Times New Roman" w:hAnsi="Times New Roman" w:cs="Times New Roman"/>
@@ -11974,6 +11946,13 @@
           <m:t>S</m:t>
         </m:r>
       </m:oMath>
+      <w:r>
+        <w:rPr>
+          <w:rFonts w:ascii="Times New Roman" w:eastAsiaTheme="minorEastAsia" w:hAnsi="Times New Roman" w:cs="Times New Roman"/>
+          <w:lang w:val="en-US"/>
+        </w:rPr>
+        <w:t xml:space="preserve"> </w:t>
+      </w:r>
       <w:r>
         <w:rPr>
           <w:rFonts w:ascii="Times New Roman" w:hAnsi="Times New Roman" w:cs="Times New Roman"/>
@@ -12196,7 +12175,6 @@
           <w:rFonts w:ascii="Times New Roman" w:hAnsi="Times New Roman" w:cs="Times New Roman"/>
           <w:lang w:val="en-US"/>
         </w:rPr>
-        <w:lastRenderedPageBreak/>
         <w:t xml:space="preserve">Battery energy is updated after every </w:t>
       </w:r>
       <w:proofErr w:type="gramStart"/>
@@ -12224,6 +12202,13 @@
           <m:t>i</m:t>
         </m:r>
       </m:oMath>
+      <w:r>
+        <w:rPr>
+          <w:rFonts w:ascii="Times New Roman" w:eastAsiaTheme="minorEastAsia" w:hAnsi="Times New Roman" w:cs="Times New Roman"/>
+          <w:lang w:val="en-US"/>
+        </w:rPr>
+        <w:t xml:space="preserve"> </w:t>
+      </w:r>
       <w:r>
         <w:rPr>
           <w:rFonts w:ascii="Times New Roman" w:hAnsi="Times New Roman" w:cs="Times New Roman"/>
@@ -12812,7 +12797,7 @@
         <w:jc w:val="both"/>
         <w:rPr>
           <w:rFonts w:ascii="Times New Roman" w:hAnsi="Times New Roman" w:cs="Times New Roman"/>
-          <w:lang w:val="fr-MA"/>
+          <w:lang w:val="en-US"/>
         </w:rPr>
       </w:pPr>
       <w:r>
@@ -12825,71 +12810,40 @@
       <w:r>
         <w:rPr>
           <w:rFonts w:ascii="Times New Roman" w:hAnsi="Times New Roman" w:cs="Times New Roman"/>
-          <w:lang w:val="fr-MA"/>
-        </w:rPr>
-        <w:t xml:space="preserve">The first </w:t>
-      </w:r>
-      <w:proofErr w:type="spellStart"/>
-      <w:r>
-        <w:rPr>
-          <w:rFonts w:ascii="Times New Roman" w:hAnsi="Times New Roman" w:cs="Times New Roman"/>
-          <w:lang w:val="fr-MA"/>
-        </w:rPr>
-        <w:t>is</w:t>
-      </w:r>
-      <w:proofErr w:type="spellEnd"/>
-      <w:r>
-        <w:rPr>
-          <w:rFonts w:ascii="Times New Roman" w:hAnsi="Times New Roman" w:cs="Times New Roman"/>
-          <w:lang w:val="fr-MA"/>
+          <w:lang w:val="en-US"/>
+        </w:rPr>
+        <w:t>The first is fleet size</w:t>
+      </w:r>
+      <w:r>
+        <w:rPr>
+          <w:rFonts w:ascii="Times New Roman" w:hAnsi="Times New Roman" w:cs="Times New Roman"/>
+          <w:lang w:val="en-US"/>
         </w:rPr>
         <w:t xml:space="preserve"> </w:t>
       </w:r>
-      <w:proofErr w:type="spellStart"/>
-      <w:r>
-        <w:rPr>
-          <w:rFonts w:ascii="Times New Roman" w:hAnsi="Times New Roman" w:cs="Times New Roman"/>
-          <w:lang w:val="fr-MA"/>
-        </w:rPr>
-        <w:t>fleet</w:t>
-      </w:r>
-      <w:proofErr w:type="spellEnd"/>
-      <w:r>
-        <w:rPr>
-          <w:rFonts w:ascii="Times New Roman" w:hAnsi="Times New Roman" w:cs="Times New Roman"/>
-          <w:lang w:val="fr-MA"/>
-        </w:rPr>
-        <w:t xml:space="preserve"> size,</w:t>
-      </w:r>
-    </w:p>
-    <w:p>
-      <w:pPr>
-        <w:jc w:val="both"/>
-        <w:rPr>
-          <w:rFonts w:ascii="Times New Roman" w:hAnsi="Times New Roman" w:cs="Times New Roman"/>
-          <w:lang w:val="fr-MA"/>
-        </w:rPr>
-      </w:pPr>
-      <m:oMathPara>
-        <m:oMath>
-          <m:r>
-            <w:rPr>
-              <w:rFonts w:ascii="Cambria Math" w:hAnsi="Cambria Math" w:cs="Times New Roman"/>
-              <w:lang w:val="fr-MA"/>
-            </w:rPr>
-            <m:t>K</m:t>
-          </m:r>
-        </m:oMath>
-      </m:oMathPara>
-    </w:p>
-    <w:p>
-      <w:pPr>
-        <w:jc w:val="both"/>
-        <w:rPr>
-          <w:rFonts w:ascii="Times New Roman" w:hAnsi="Times New Roman" w:cs="Times New Roman"/>
-          <w:lang w:val="en-US"/>
-        </w:rPr>
-      </w:pPr>
+      <m:oMath>
+        <m:r>
+          <w:rPr>
+            <w:rFonts w:ascii="Cambria Math" w:hAnsi="Cambria Math" w:cs="Times New Roman"/>
+            <w:lang w:val="fr-MA"/>
+          </w:rPr>
+          <m:t>K</m:t>
+        </m:r>
+      </m:oMath>
+      <w:r>
+        <w:rPr>
+          <w:rFonts w:ascii="Times New Roman" w:hAnsi="Times New Roman" w:cs="Times New Roman"/>
+          <w:lang w:val="en-US"/>
+        </w:rPr>
+        <w:t>,</w:t>
+      </w:r>
+      <w:r>
+        <w:rPr>
+          <w:rFonts w:ascii="Times New Roman" w:hAnsi="Times New Roman" w:cs="Times New Roman"/>
+          <w:lang w:val="en-US"/>
+        </w:rPr>
+        <w:t xml:space="preserve"> </w:t>
+      </w:r>
       <w:r>
         <w:rPr>
           <w:rFonts w:ascii="Times New Roman" w:hAnsi="Times New Roman" w:cs="Times New Roman"/>
@@ -13059,6 +13013,13 @@
       </m:oMath>
       <w:r>
         <w:rPr>
+          <w:rFonts w:ascii="Times New Roman" w:eastAsiaTheme="minorEastAsia" w:hAnsi="Times New Roman" w:cs="Times New Roman"/>
+          <w:lang w:val="en-US"/>
+        </w:rPr>
+        <w:t xml:space="preserve"> </w:t>
+      </w:r>
+      <w:r>
+        <w:rPr>
           <w:rFonts w:ascii="Times New Roman" w:hAnsi="Times New Roman" w:cs="Times New Roman"/>
           <w:lang w:val="en-US"/>
         </w:rPr>
@@ -13115,14 +13076,7 @@
                   <w:rFonts w:ascii="Cambria Math" w:hAnsi="Cambria Math" w:cs="Times New Roman"/>
                   <w:lang w:val="fr-MA"/>
                 </w:rPr>
-                <m:t>c</m:t>
-              </m:r>
-              <m:r>
-                <w:rPr>
-                  <w:rFonts w:ascii="Cambria Math" w:hAnsi="Cambria Math" w:cs="Times New Roman"/>
-                  <w:lang w:val="fr-MA"/>
-                </w:rPr>
-                <m:t>h</m:t>
+                <m:t>ch</m:t>
               </m:r>
             </m:sub>
           </m:sSub>
@@ -13186,49 +13140,7 @@
                           <w:rFonts w:ascii="Cambria Math" w:hAnsi="Cambria Math" w:cs="Times New Roman"/>
                           <w:lang w:val="fr-MA"/>
                         </w:rPr>
-                        <m:t>s</m:t>
-                      </m:r>
-                      <m:r>
-                        <w:rPr>
-                          <w:rFonts w:ascii="Cambria Math" w:hAnsi="Cambria Math" w:cs="Times New Roman"/>
-                          <w:lang w:val="fr-MA"/>
-                        </w:rPr>
-                        <m:t>:</m:t>
-                      </m:r>
-                      <m:r>
-                        <w:rPr>
-                          <w:rFonts w:ascii="Cambria Math" w:hAnsi="Cambria Math" w:cs="Times New Roman"/>
-                          <w:lang w:val="fr-MA"/>
-                        </w:rPr>
-                        <m:t>s</m:t>
-                      </m:r>
-                      <m:r>
-                        <w:rPr>
-                          <w:rFonts w:ascii="Cambria Math" w:hAnsi="Cambria Math" w:cs="Times New Roman"/>
-                          <w:lang w:val="fr-MA"/>
-                        </w:rPr>
-                        <m:t>∈</m:t>
-                      </m:r>
-                      <m:r>
-                        <w:rPr>
-                          <w:rFonts w:ascii="Cambria Math" w:hAnsi="Cambria Math" w:cs="Times New Roman"/>
-                          <w:lang w:val="fr-MA"/>
-                        </w:rPr>
-                        <m:t>R</m:t>
-                      </m:r>
-                      <m:r>
-                        <w:rPr>
-                          <w:rFonts w:ascii="Cambria Math" w:hAnsi="Cambria Math" w:cs="Times New Roman"/>
-                          <w:lang w:val="fr-MA"/>
-                        </w:rPr>
-                        <m:t>∩</m:t>
-                      </m:r>
-                      <m:r>
-                        <w:rPr>
-                          <w:rFonts w:ascii="Cambria Math" w:hAnsi="Cambria Math" w:cs="Times New Roman"/>
-                          <w:lang w:val="fr-MA"/>
-                        </w:rPr>
-                        <m:t>S</m:t>
+                        <m:t>s:s∈R∩S</m:t>
                       </m:r>
                     </m:e>
                   </m:d>
@@ -13330,14 +13242,7 @@
                   <w:rFonts w:ascii="Cambria Math" w:hAnsi="Cambria Math" w:cs="Times New Roman"/>
                   <w:lang w:val="fr-MA"/>
                 </w:rPr>
-                <m:t>c</m:t>
-              </m:r>
-              <m:r>
-                <w:rPr>
-                  <w:rFonts w:ascii="Cambria Math" w:hAnsi="Cambria Math" w:cs="Times New Roman"/>
-                  <w:lang w:val="fr-MA"/>
-                </w:rPr>
-                <m:t>h</m:t>
+                <m:t>ch</m:t>
               </m:r>
             </m:sub>
           </m:sSub>
@@ -13367,14 +13272,7 @@
                   <w:rFonts w:ascii="Cambria Math" w:hAnsi="Cambria Math" w:cs="Times New Roman"/>
                   <w:lang w:val="fr-MA"/>
                 </w:rPr>
-                <m:t>s</m:t>
-              </m:r>
-              <m:r>
-                <w:rPr>
-                  <w:rFonts w:ascii="Cambria Math" w:hAnsi="Cambria Math" w:cs="Times New Roman"/>
-                  <w:lang w:val="fr-MA"/>
-                </w:rPr>
-                <m:t>∈</m:t>
+                <m:t>s∈</m:t>
               </m:r>
               <m:sSub>
                 <m:sSubPr>
@@ -13403,14 +13301,7 @@
                       <w:rFonts w:ascii="Cambria Math" w:hAnsi="Cambria Math" w:cs="Times New Roman"/>
                       <w:lang w:val="fr-MA"/>
                     </w:rPr>
-                    <m:t>c</m:t>
-                  </m:r>
-                  <m:r>
-                    <w:rPr>
-                      <w:rFonts w:ascii="Cambria Math" w:hAnsi="Cambria Math" w:cs="Times New Roman"/>
-                      <w:lang w:val="fr-MA"/>
-                    </w:rPr>
-                    <m:t>h</m:t>
+                    <m:t>ch</m:t>
                   </m:r>
                 </m:sub>
               </m:sSub>
@@ -13584,14 +13475,7 @@
                   <w:rFonts w:ascii="Cambria Math" w:hAnsi="Cambria Math" w:cs="Times New Roman"/>
                   <w:lang w:val="fr-MA"/>
                 </w:rPr>
-                <m:t>s</m:t>
-              </m:r>
-              <m:r>
-                <w:rPr>
-                  <w:rFonts w:ascii="Cambria Math" w:hAnsi="Cambria Math" w:cs="Times New Roman"/>
-                  <w:lang w:val="fr-MA"/>
-                </w:rPr>
-                <m:t>∈</m:t>
+                <m:t>s∈</m:t>
               </m:r>
               <m:sSub>
                 <m:sSubPr>
@@ -13620,14 +13504,7 @@
                       <w:rFonts w:ascii="Cambria Math" w:hAnsi="Cambria Math" w:cs="Times New Roman"/>
                       <w:lang w:val="fr-MA"/>
                     </w:rPr>
-                    <m:t>c</m:t>
-                  </m:r>
-                  <m:r>
-                    <w:rPr>
-                      <w:rFonts w:ascii="Cambria Math" w:hAnsi="Cambria Math" w:cs="Times New Roman"/>
-                      <w:lang w:val="fr-MA"/>
-                    </w:rPr>
-                    <m:t>h</m:t>
+                    <m:t>ch</m:t>
                   </m:r>
                 </m:sub>
               </m:sSub>
@@ -13730,14 +13607,7 @@
                   <w:rFonts w:ascii="Cambria Math" w:hAnsi="Cambria Math" w:cs="Times New Roman"/>
                   <w:lang w:val="fr-MA"/>
                 </w:rPr>
-                <m:t>c</m:t>
-              </m:r>
-              <m:r>
-                <w:rPr>
-                  <w:rFonts w:ascii="Cambria Math" w:hAnsi="Cambria Math" w:cs="Times New Roman"/>
-                  <w:lang w:val="fr-MA"/>
-                </w:rPr>
-                <m:t>h</m:t>
+                <m:t>ch</m:t>
               </m:r>
             </m:sub>
           </m:sSub>
@@ -13767,14 +13637,7 @@
                   <w:rFonts w:ascii="Cambria Math" w:hAnsi="Cambria Math" w:cs="Times New Roman"/>
                   <w:lang w:val="fr-MA"/>
                 </w:rPr>
-                <m:t>s</m:t>
-              </m:r>
-              <m:r>
-                <w:rPr>
-                  <w:rFonts w:ascii="Cambria Math" w:hAnsi="Cambria Math" w:cs="Times New Roman"/>
-                  <w:lang w:val="fr-MA"/>
-                </w:rPr>
-                <m:t>∈</m:t>
+                <m:t>s∈</m:t>
               </m:r>
               <m:sSub>
                 <m:sSubPr>
@@ -13803,14 +13666,7 @@
                       <w:rFonts w:ascii="Cambria Math" w:hAnsi="Cambria Math" w:cs="Times New Roman"/>
                       <w:lang w:val="fr-MA"/>
                     </w:rPr>
-                    <m:t>c</m:t>
-                  </m:r>
-                  <m:r>
-                    <w:rPr>
-                      <w:rFonts w:ascii="Cambria Math" w:hAnsi="Cambria Math" w:cs="Times New Roman"/>
-                      <w:lang w:val="fr-MA"/>
-                    </w:rPr>
-                    <m:t>h</m:t>
+                    <m:t>ch</m:t>
                   </m:r>
                 </m:sub>
               </m:sSub>
@@ -13942,14 +13798,7 @@
                   <w:rFonts w:ascii="Cambria Math" w:hAnsi="Cambria Math" w:cs="Times New Roman"/>
                   <w:lang w:val="fr-MA"/>
                 </w:rPr>
-                <m:t>c</m:t>
-              </m:r>
-              <m:r>
-                <w:rPr>
-                  <w:rFonts w:ascii="Cambria Math" w:hAnsi="Cambria Math" w:cs="Times New Roman"/>
-                  <w:lang w:val="fr-MA"/>
-                </w:rPr>
-                <m:t>h</m:t>
+                <m:t>ch</m:t>
               </m:r>
             </m:sub>
           </m:sSub>
@@ -13979,14 +13828,7 @@
                   <w:rFonts w:ascii="Cambria Math" w:hAnsi="Cambria Math" w:cs="Times New Roman"/>
                   <w:lang w:val="fr-MA"/>
                 </w:rPr>
-                <m:t>s</m:t>
-              </m:r>
-              <m:r>
-                <w:rPr>
-                  <w:rFonts w:ascii="Cambria Math" w:hAnsi="Cambria Math" w:cs="Times New Roman"/>
-                  <w:lang w:val="fr-MA"/>
-                </w:rPr>
-                <m:t>∈</m:t>
+                <m:t>s∈</m:t>
               </m:r>
               <m:sSub>
                 <m:sSubPr>
@@ -14015,14 +13857,7 @@
                       <w:rFonts w:ascii="Cambria Math" w:hAnsi="Cambria Math" w:cs="Times New Roman"/>
                       <w:lang w:val="fr-MA"/>
                     </w:rPr>
-                    <m:t>c</m:t>
-                  </m:r>
-                  <m:r>
-                    <w:rPr>
-                      <w:rFonts w:ascii="Cambria Math" w:hAnsi="Cambria Math" w:cs="Times New Roman"/>
-                      <w:lang w:val="fr-MA"/>
-                    </w:rPr>
-                    <m:t>h</m:t>
+                    <m:t>ch</m:t>
                   </m:r>
                 </m:sub>
               </m:sSub>
@@ -14170,14 +14005,7 @@
                       <w:rFonts w:ascii="Cambria Math" w:hAnsi="Cambria Math" w:cs="Times New Roman"/>
                       <w:lang w:val="fr-MA"/>
                     </w:rPr>
-                    <m:t>c</m:t>
-                  </m:r>
-                  <m:r>
-                    <w:rPr>
-                      <w:rFonts w:ascii="Cambria Math" w:hAnsi="Cambria Math" w:cs="Times New Roman"/>
-                      <w:lang w:val="fr-MA"/>
-                    </w:rPr>
-                    <m:t>h</m:t>
+                    <m:t>ch</m:t>
                   </m:r>
                 </m:sub>
               </m:sSub>
@@ -14207,14 +14035,7 @@
                       <w:rFonts w:ascii="Cambria Math" w:hAnsi="Cambria Math" w:cs="Times New Roman"/>
                       <w:lang w:val="fr-MA"/>
                     </w:rPr>
-                    <m:t>c</m:t>
-                  </m:r>
-                  <m:r>
-                    <w:rPr>
-                      <w:rFonts w:ascii="Cambria Math" w:hAnsi="Cambria Math" w:cs="Times New Roman"/>
-                      <w:lang w:val="fr-MA"/>
-                    </w:rPr>
-                    <m:t>h</m:t>
+                    <m:t>ch</m:t>
                   </m:r>
                 </m:sub>
               </m:sSub>
@@ -14313,14 +14134,7 @@
                       <w:rFonts w:ascii="Cambria Math" w:hAnsi="Cambria Math" w:cs="Times New Roman"/>
                       <w:lang w:val="fr-MA"/>
                     </w:rPr>
-                    <m:t>c</m:t>
-                  </m:r>
-                  <m:r>
-                    <w:rPr>
-                      <w:rFonts w:ascii="Cambria Math" w:hAnsi="Cambria Math" w:cs="Times New Roman"/>
-                      <w:lang w:val="fr-MA"/>
-                    </w:rPr>
-                    <m:t>h</m:t>
+                    <m:t>ch</m:t>
                   </m:r>
                 </m:sub>
               </m:sSub>
@@ -14389,14 +14203,7 @@
                       <w:rFonts w:ascii="Cambria Math" w:hAnsi="Cambria Math" w:cs="Times New Roman"/>
                       <w:lang w:val="fr-MA"/>
                     </w:rPr>
-                    <m:t>c</m:t>
-                  </m:r>
-                  <m:r>
-                    <w:rPr>
-                      <w:rFonts w:ascii="Cambria Math" w:hAnsi="Cambria Math" w:cs="Times New Roman"/>
-                      <w:lang w:val="fr-MA"/>
-                    </w:rPr>
-                    <m:t>h</m:t>
+                    <m:t>ch</m:t>
                   </m:r>
                 </m:sub>
               </m:sSub>
@@ -14426,14 +14233,7 @@
                       <w:rFonts w:ascii="Cambria Math" w:hAnsi="Cambria Math" w:cs="Times New Roman"/>
                       <w:lang w:val="fr-MA"/>
                     </w:rPr>
-                    <m:t>c</m:t>
-                  </m:r>
-                  <m:r>
-                    <w:rPr>
-                      <w:rFonts w:ascii="Cambria Math" w:hAnsi="Cambria Math" w:cs="Times New Roman"/>
-                      <w:lang w:val="fr-MA"/>
-                    </w:rPr>
-                    <m:t>h</m:t>
+                    <m:t>ch</m:t>
                   </m:r>
                 </m:sub>
               </m:sSub>
@@ -14677,14 +14477,7 @@
                       <w:rFonts w:ascii="Cambria Math" w:hAnsi="Cambria Math" w:cs="Times New Roman"/>
                       <w:lang w:val="fr-MA"/>
                     </w:rPr>
-                    <m:t>c</m:t>
-                  </m:r>
-                  <m:r>
-                    <w:rPr>
-                      <w:rFonts w:ascii="Cambria Math" w:hAnsi="Cambria Math" w:cs="Times New Roman"/>
-                      <w:lang w:val="fr-MA"/>
-                    </w:rPr>
-                    <m:t>h</m:t>
+                    <m:t>ch</m:t>
                   </m:r>
                 </m:sub>
               </m:sSub>
@@ -14709,14 +14502,7 @@
                   <w:rFonts w:ascii="Cambria Math" w:hAnsi="Cambria Math" w:cs="Times New Roman"/>
                   <w:lang w:val="fr-MA"/>
                 </w:rPr>
-                <m:t>s</m:t>
-              </m:r>
-              <m:r>
-                <w:rPr>
-                  <w:rFonts w:ascii="Cambria Math" w:hAnsi="Cambria Math" w:cs="Times New Roman"/>
-                  <w:lang w:val="fr-MA"/>
-                </w:rPr>
-                <m:t>∈</m:t>
+                <m:t>s∈</m:t>
               </m:r>
               <m:sSub>
                 <m:sSubPr>
@@ -14745,14 +14531,7 @@
                       <w:rFonts w:ascii="Cambria Math" w:hAnsi="Cambria Math" w:cs="Times New Roman"/>
                       <w:lang w:val="fr-MA"/>
                     </w:rPr>
-                    <m:t>c</m:t>
-                  </m:r>
-                  <m:r>
-                    <w:rPr>
-                      <w:rFonts w:ascii="Cambria Math" w:hAnsi="Cambria Math" w:cs="Times New Roman"/>
-                      <w:lang w:val="fr-MA"/>
-                    </w:rPr>
-                    <m:t>h</m:t>
+                    <m:t>ch</m:t>
                   </m:r>
                 </m:sub>
               </m:sSub>
@@ -14802,13 +14581,6 @@
               </m:sSub>
             </m:e>
           </m:nary>
-          <m:r>
-            <w:rPr>
-              <w:rFonts w:ascii="Cambria Math" w:hAnsi="Cambria Math" w:cs="Times New Roman"/>
-              <w:lang w:val="fr-MA"/>
-            </w:rPr>
-            <m:t>,</m:t>
-          </m:r>
         </m:oMath>
       </m:oMathPara>
     </w:p>
@@ -14941,14 +14713,7 @@
                       <w:rFonts w:ascii="Cambria Math" w:hAnsi="Cambria Math" w:cs="Times New Roman"/>
                       <w:lang w:val="fr-MA"/>
                     </w:rPr>
-                    <m:t>c</m:t>
-                  </m:r>
-                  <m:r>
-                    <w:rPr>
-                      <w:rFonts w:ascii="Cambria Math" w:hAnsi="Cambria Math" w:cs="Times New Roman"/>
-                      <w:lang w:val="fr-MA"/>
-                    </w:rPr>
-                    <m:t>h</m:t>
+                    <m:t>ch</m:t>
                   </m:r>
                 </m:sub>
               </m:sSub>
@@ -14973,14 +14738,7 @@
                   <w:rFonts w:ascii="Cambria Math" w:hAnsi="Cambria Math" w:cs="Times New Roman"/>
                   <w:lang w:val="fr-MA"/>
                 </w:rPr>
-                <m:t>s</m:t>
-              </m:r>
-              <m:r>
-                <w:rPr>
-                  <w:rFonts w:ascii="Cambria Math" w:hAnsi="Cambria Math" w:cs="Times New Roman"/>
-                  <w:lang w:val="fr-MA"/>
-                </w:rPr>
-                <m:t>∈</m:t>
+                <m:t>s∈</m:t>
               </m:r>
               <m:sSub>
                 <m:sSubPr>
@@ -15009,14 +14767,7 @@
                       <w:rFonts w:ascii="Cambria Math" w:hAnsi="Cambria Math" w:cs="Times New Roman"/>
                       <w:lang w:val="fr-MA"/>
                     </w:rPr>
-                    <m:t>c</m:t>
-                  </m:r>
-                  <m:r>
-                    <w:rPr>
-                      <w:rFonts w:ascii="Cambria Math" w:hAnsi="Cambria Math" w:cs="Times New Roman"/>
-                      <w:lang w:val="fr-MA"/>
-                    </w:rPr>
-                    <m:t>h</m:t>
+                    <m:t>ch</m:t>
                   </m:r>
                 </m:sub>
               </m:sSub>
@@ -15066,13 +14817,6 @@
               </m:sSub>
             </m:e>
           </m:nary>
-          <m:r>
-            <w:rPr>
-              <w:rFonts w:ascii="Cambria Math" w:hAnsi="Cambria Math" w:cs="Times New Roman"/>
-              <w:lang w:val="fr-MA"/>
-            </w:rPr>
-            <m:t>,</m:t>
-          </m:r>
         </m:oMath>
       </m:oMathPara>
     </w:p>
@@ -15196,14 +14940,7 @@
                       <w:rFonts w:ascii="Cambria Math" w:hAnsi="Cambria Math" w:cs="Times New Roman"/>
                       <w:lang w:val="fr-MA"/>
                     </w:rPr>
-                    <m:t>c</m:t>
-                  </m:r>
-                  <m:r>
-                    <w:rPr>
-                      <w:rFonts w:ascii="Cambria Math" w:hAnsi="Cambria Math" w:cs="Times New Roman"/>
-                      <w:lang w:val="fr-MA"/>
-                    </w:rPr>
-                    <m:t>h</m:t>
+                    <m:t>ch</m:t>
                   </m:r>
                 </m:sub>
               </m:sSub>
@@ -15228,14 +14965,7 @@
                   <w:rFonts w:ascii="Cambria Math" w:hAnsi="Cambria Math" w:cs="Times New Roman"/>
                   <w:lang w:val="fr-MA"/>
                 </w:rPr>
-                <m:t>s</m:t>
-              </m:r>
-              <m:r>
-                <w:rPr>
-                  <w:rFonts w:ascii="Cambria Math" w:hAnsi="Cambria Math" w:cs="Times New Roman"/>
-                  <w:lang w:val="fr-MA"/>
-                </w:rPr>
-                <m:t>∈</m:t>
+                <m:t>s∈</m:t>
               </m:r>
               <m:sSub>
                 <m:sSubPr>
@@ -15264,14 +14994,7 @@
                       <w:rFonts w:ascii="Cambria Math" w:hAnsi="Cambria Math" w:cs="Times New Roman"/>
                       <w:lang w:val="fr-MA"/>
                     </w:rPr>
-                    <m:t>c</m:t>
-                  </m:r>
-                  <m:r>
-                    <w:rPr>
-                      <w:rFonts w:ascii="Cambria Math" w:hAnsi="Cambria Math" w:cs="Times New Roman"/>
-                      <w:lang w:val="fr-MA"/>
-                    </w:rPr>
-                    <m:t>h</m:t>
+                    <m:t>ch</m:t>
                   </m:r>
                 </m:sub>
               </m:sSub>
@@ -15308,13 +15031,6 @@
               </m:sSub>
             </m:e>
           </m:nary>
-          <m:r>
-            <w:rPr>
-              <w:rFonts w:ascii="Cambria Math" w:hAnsi="Cambria Math" w:cs="Times New Roman"/>
-              <w:lang w:val="fr-MA"/>
-            </w:rPr>
-            <m:t>.</m:t>
-          </m:r>
         </m:oMath>
       </m:oMathPara>
     </w:p>
@@ -15387,11 +15103,30 @@
           <w:lang w:val="en-US"/>
         </w:rPr>
         <w:lastRenderedPageBreak/>
-        <w:t>vehicles to the depot. The measures defined above are used to evaluate routing and charging performance. They should not be interpreted as a single optimization objective; the phase-specific rules used to rank and accept candidate solutions are defined in Section 4.</w:t>
+        <w:t>vehicles to the depot. The measures defined above are used to evaluate routing and charging performance. They should not be interpreted as a single optimization objective</w:t>
+      </w:r>
+      <w:r>
+        <w:rPr>
+          <w:rFonts w:ascii="Times New Roman" w:hAnsi="Times New Roman" w:cs="Times New Roman"/>
+          <w:lang w:val="en-US"/>
+        </w:rPr>
+        <w:t>,</w:t>
+      </w:r>
+      <w:r>
+        <w:rPr>
+          <w:rFonts w:ascii="Times New Roman" w:hAnsi="Times New Roman" w:cs="Times New Roman"/>
+          <w:lang w:val="en-US"/>
+        </w:rPr>
+        <w:t xml:space="preserve"> the phase-specific rules used to rank and accept candidate solutions are defined in Section 4.</w:t>
       </w:r>
     </w:p>
     <w:p>
       <w:pPr>
+        <w:pStyle w:val="Paragraphedeliste"/>
+        <w:numPr>
+          <w:ilvl w:val="0"/>
+          <w:numId w:val="25"/>
+        </w:numPr>
         <w:jc w:val="both"/>
         <w:rPr>
           <w:rFonts w:ascii="Times New Roman" w:hAnsi="Times New Roman" w:cs="Times New Roman"/>
@@ -15444,6 +15179,11 @@
     </w:p>
     <w:p>
       <w:pPr>
+        <w:pStyle w:val="Paragraphedeliste"/>
+        <w:numPr>
+          <w:ilvl w:val="1"/>
+          <w:numId w:val="25"/>
+        </w:numPr>
         <w:jc w:val="both"/>
         <w:rPr>
           <w:rFonts w:ascii="Times New Roman" w:hAnsi="Times New Roman" w:cs="Times New Roman"/>
@@ -15571,14 +15311,7 @@
               <w:rFonts w:ascii="Cambria Math" w:hAnsi="Cambria Math" w:cs="Times New Roman"/>
               <w:lang w:val="fr-MA"/>
             </w:rPr>
-            <m:t>=</m:t>
-          </m:r>
-          <m:r>
-            <w:rPr>
-              <w:rFonts w:ascii="Cambria Math" w:hAnsi="Cambria Math" w:cs="Times New Roman"/>
-              <w:lang w:val="fr-MA"/>
-            </w:rPr>
-            <m:t>K</m:t>
+            <m:t>=K</m:t>
           </m:r>
           <m:d>
             <m:dPr>
@@ -15684,14 +15417,7 @@
               <w:rFonts w:ascii="Cambria Math" w:hAnsi="Cambria Math" w:cs="Times New Roman"/>
               <w:lang w:val="fr-MA"/>
             </w:rPr>
-            <m:t>=</m:t>
-          </m:r>
-          <m:r>
-            <w:rPr>
-              <w:rFonts w:ascii="Cambria Math" w:hAnsi="Cambria Math" w:cs="Times New Roman"/>
-              <w:lang w:val="fr-MA"/>
-            </w:rPr>
-            <m:t>D</m:t>
+            <m:t>=D</m:t>
           </m:r>
           <m:d>
             <m:dPr>
@@ -15733,13 +15459,6 @@
               </m:sSup>
             </m:e>
           </m:d>
-          <m:r>
-            <w:rPr>
-              <w:rFonts w:ascii="Cambria Math" w:hAnsi="Cambria Math" w:cs="Times New Roman"/>
-              <w:lang w:val="fr-MA"/>
-            </w:rPr>
-            <m:t>.</m:t>
-          </m:r>
         </m:oMath>
       </m:oMathPara>
     </w:p>
@@ -15788,6 +15507,13 @@
           </m:sup>
         </m:sSup>
       </m:oMath>
+      <w:r>
+        <w:rPr>
+          <w:rFonts w:ascii="Times New Roman" w:eastAsiaTheme="minorEastAsia" w:hAnsi="Times New Roman" w:cs="Times New Roman"/>
+          <w:lang w:val="en-US"/>
+        </w:rPr>
+        <w:t xml:space="preserve"> </w:t>
+      </w:r>
       <w:r>
         <w:rPr>
           <w:rFonts w:ascii="Times New Roman" w:hAnsi="Times New Roman" w:cs="Times New Roman"/>
@@ -15843,212 +15569,205 @@
       </m:oMath>
       <w:r>
         <w:rPr>
+          <w:rFonts w:ascii="Times New Roman" w:eastAsiaTheme="minorEastAsia" w:hAnsi="Times New Roman" w:cs="Times New Roman"/>
+          <w:lang w:val="en-US"/>
+        </w:rPr>
+        <w:t xml:space="preserve"> </w:t>
+      </w:r>
+      <w:r>
+        <w:rPr>
           <w:rFonts w:ascii="Times New Roman" w:hAnsi="Times New Roman" w:cs="Times New Roman"/>
           <w:lang w:val="en-US"/>
         </w:rPr>
         <w:t>is admissible only if</w:t>
       </w:r>
-    </w:p>
-    <w:p>
-      <w:pPr>
-        <w:jc w:val="both"/>
-        <w:rPr>
-          <w:rFonts w:ascii="Times New Roman" w:hAnsi="Times New Roman" w:cs="Times New Roman"/>
-          <w:lang w:val="fr-MA"/>
-        </w:rPr>
-      </w:pPr>
-      <m:oMathPara>
-        <m:oMath>
-          <m:r>
-            <w:rPr>
-              <w:rFonts w:ascii="Cambria Math" w:hAnsi="Cambria Math" w:cs="Times New Roman"/>
-              <w:lang w:val="fr-MA"/>
-            </w:rPr>
-            <m:t>K</m:t>
-          </m:r>
-          <m:d>
-            <m:dPr>
-              <m:ctrlPr>
-                <w:rPr>
-                  <w:rFonts w:ascii="Cambria Math" w:hAnsi="Cambria Math" w:cs="Times New Roman"/>
-                  <w:lang w:val="fr-MA"/>
-                </w:rPr>
-              </m:ctrlPr>
-            </m:dPr>
-            <m:e>
-              <m:r>
-                <w:rPr>
-                  <w:rFonts w:ascii="Cambria Math" w:hAnsi="Cambria Math" w:cs="Times New Roman"/>
-                  <w:lang w:val="fr-MA"/>
-                </w:rPr>
-                <m:t>X</m:t>
-              </m:r>
-            </m:e>
-          </m:d>
-          <m:r>
-            <w:rPr>
-              <w:rFonts w:ascii="Cambria Math" w:hAnsi="Cambria Math" w:cs="Times New Roman"/>
-              <w:lang w:val="fr-MA"/>
-            </w:rPr>
-            <m:t>=</m:t>
-          </m:r>
-          <m:sSup>
-            <m:sSupPr>
-              <m:ctrlPr>
-                <w:rPr>
-                  <w:rFonts w:ascii="Cambria Math" w:hAnsi="Cambria Math" w:cs="Times New Roman"/>
-                  <w:lang w:val="fr-MA"/>
-                </w:rPr>
-              </m:ctrlPr>
-            </m:sSupPr>
-            <m:e>
-              <m:r>
-                <w:rPr>
-                  <w:rFonts w:ascii="Cambria Math" w:hAnsi="Cambria Math" w:cs="Times New Roman"/>
-                  <w:lang w:val="fr-MA"/>
-                </w:rPr>
-                <m:t>K</m:t>
-              </m:r>
-            </m:e>
-            <m:sup>
-              <m:r>
-                <w:rPr>
-                  <w:rFonts w:ascii="Cambria Math" w:hAnsi="Cambria Math" w:cs="Times New Roman"/>
-                  <w:lang w:val="fr-MA"/>
-                </w:rPr>
-                <m:t>*</m:t>
-              </m:r>
-            </m:sup>
-          </m:sSup>
-        </m:oMath>
-      </m:oMathPara>
-    </w:p>
-    <w:p>
-      <w:pPr>
-        <w:jc w:val="both"/>
-        <w:rPr>
-          <w:rFonts w:ascii="Times New Roman" w:hAnsi="Times New Roman" w:cs="Times New Roman"/>
-          <w:lang w:val="fr-MA"/>
-        </w:rPr>
-      </w:pPr>
-      <w:proofErr w:type="gramStart"/>
-      <w:r>
-        <w:rPr>
-          <w:rFonts w:ascii="Times New Roman" w:hAnsi="Times New Roman" w:cs="Times New Roman"/>
-          <w:lang w:val="fr-MA"/>
+      <w:r>
+        <w:rPr>
+          <w:rFonts w:ascii="Times New Roman" w:hAnsi="Times New Roman" w:cs="Times New Roman"/>
+          <w:lang w:val="en-US"/>
+        </w:rPr>
+        <w:t xml:space="preserve"> </w:t>
+      </w:r>
+      <m:oMath>
+        <m:r>
+          <w:rPr>
+            <w:rFonts w:ascii="Cambria Math" w:hAnsi="Cambria Math" w:cs="Times New Roman"/>
+            <w:lang w:val="fr-MA"/>
+          </w:rPr>
+          <m:t>K</m:t>
+        </m:r>
+        <m:d>
+          <m:dPr>
+            <m:ctrlPr>
+              <w:rPr>
+                <w:rFonts w:ascii="Cambria Math" w:hAnsi="Cambria Math" w:cs="Times New Roman"/>
+                <w:lang w:val="fr-MA"/>
+              </w:rPr>
+            </m:ctrlPr>
+          </m:dPr>
+          <m:e>
+            <m:r>
+              <w:rPr>
+                <w:rFonts w:ascii="Cambria Math" w:hAnsi="Cambria Math" w:cs="Times New Roman"/>
+                <w:lang w:val="fr-MA"/>
+              </w:rPr>
+              <m:t>X</m:t>
+            </m:r>
+          </m:e>
+        </m:d>
+        <m:r>
+          <w:rPr>
+            <w:rFonts w:ascii="Cambria Math" w:hAnsi="Cambria Math" w:cs="Times New Roman"/>
+            <w:lang w:val="en-US"/>
+          </w:rPr>
+          <m:t>=</m:t>
+        </m:r>
+        <m:sSup>
+          <m:sSupPr>
+            <m:ctrlPr>
+              <w:rPr>
+                <w:rFonts w:ascii="Cambria Math" w:hAnsi="Cambria Math" w:cs="Times New Roman"/>
+                <w:lang w:val="fr-MA"/>
+              </w:rPr>
+            </m:ctrlPr>
+          </m:sSupPr>
+          <m:e>
+            <m:r>
+              <w:rPr>
+                <w:rFonts w:ascii="Cambria Math" w:hAnsi="Cambria Math" w:cs="Times New Roman"/>
+                <w:lang w:val="fr-MA"/>
+              </w:rPr>
+              <m:t>K</m:t>
+            </m:r>
+          </m:e>
+          <m:sup>
+            <m:r>
+              <w:rPr>
+                <w:rFonts w:ascii="Cambria Math" w:hAnsi="Cambria Math" w:cs="Times New Roman"/>
+                <w:lang w:val="en-US"/>
+              </w:rPr>
+              <m:t>*</m:t>
+            </m:r>
+          </m:sup>
+        </m:sSup>
+      </m:oMath>
+      <w:r>
+        <w:rPr>
+          <w:rFonts w:ascii="Times New Roman" w:hAnsi="Times New Roman" w:cs="Times New Roman"/>
+          <w:lang w:val="en-US"/>
+        </w:rPr>
+        <w:t xml:space="preserve"> </w:t>
+      </w:r>
+      <w:r>
+        <w:rPr>
+          <w:rFonts w:ascii="Times New Roman" w:hAnsi="Times New Roman" w:cs="Times New Roman"/>
+          <w:lang w:val="en-US"/>
         </w:rPr>
         <w:t>and</w:t>
       </w:r>
-      <w:proofErr w:type="gramEnd"/>
-    </w:p>
-    <w:p>
-      <w:pPr>
-        <w:jc w:val="both"/>
-        <w:rPr>
-          <w:rFonts w:ascii="Times New Roman" w:hAnsi="Times New Roman" w:cs="Times New Roman"/>
-          <w:lang w:val="fr-MA"/>
-        </w:rPr>
-      </w:pPr>
-      <m:oMathPara>
-        <m:oMath>
-          <m:r>
-            <w:rPr>
-              <w:rFonts w:ascii="Cambria Math" w:hAnsi="Cambria Math" w:cs="Times New Roman"/>
-              <w:lang w:val="fr-MA"/>
-            </w:rPr>
-            <m:t>D</m:t>
-          </m:r>
-          <m:d>
-            <m:dPr>
-              <m:ctrlPr>
-                <w:rPr>
-                  <w:rFonts w:ascii="Cambria Math" w:hAnsi="Cambria Math" w:cs="Times New Roman"/>
-                  <w:lang w:val="fr-MA"/>
-                </w:rPr>
-              </m:ctrlPr>
-            </m:dPr>
-            <m:e>
-              <m:r>
-                <w:rPr>
-                  <w:rFonts w:ascii="Cambria Math" w:hAnsi="Cambria Math" w:cs="Times New Roman"/>
-                  <w:lang w:val="fr-MA"/>
-                </w:rPr>
-                <m:t>X</m:t>
-              </m:r>
-            </m:e>
-          </m:d>
-          <m:r>
-            <w:rPr>
-              <w:rFonts w:ascii="Cambria Math" w:hAnsi="Cambria Math" w:cs="Times New Roman"/>
-              <w:lang w:val="fr-MA"/>
-            </w:rPr>
-            <m:t>≤</m:t>
-          </m:r>
-          <m:d>
-            <m:dPr>
-              <m:ctrlPr>
-                <w:rPr>
-                  <w:rFonts w:ascii="Cambria Math" w:hAnsi="Cambria Math" w:cs="Times New Roman"/>
-                  <w:lang w:val="fr-MA"/>
-                </w:rPr>
-              </m:ctrlPr>
-            </m:dPr>
-            <m:e>
-              <m:r>
-                <w:rPr>
-                  <w:rFonts w:ascii="Cambria Math" w:hAnsi="Cambria Math" w:cs="Times New Roman"/>
-                  <w:lang w:val="fr-MA"/>
-                </w:rPr>
-                <m:t>1+ε</m:t>
-              </m:r>
-            </m:e>
-          </m:d>
-          <m:sSub>
-            <m:sSubPr>
-              <m:ctrlPr>
-                <w:rPr>
-                  <w:rFonts w:ascii="Cambria Math" w:hAnsi="Cambria Math" w:cs="Times New Roman"/>
-                  <w:lang w:val="fr-MA"/>
-                </w:rPr>
-              </m:ctrlPr>
-            </m:sSubPr>
-            <m:e>
-              <m:r>
-                <w:rPr>
-                  <w:rFonts w:ascii="Cambria Math" w:hAnsi="Cambria Math" w:cs="Times New Roman"/>
-                  <w:lang w:val="fr-MA"/>
-                </w:rPr>
-                <m:t>D</m:t>
-              </m:r>
-            </m:e>
-            <m:sub>
-              <m:r>
-                <w:rPr>
-                  <w:rFonts w:ascii="Cambria Math" w:hAnsi="Cambria Math" w:cs="Times New Roman"/>
-                  <w:lang w:val="fr-MA"/>
-                </w:rPr>
-                <m:t>PR</m:t>
-              </m:r>
-            </m:sub>
-          </m:sSub>
-          <m:r>
-            <w:rPr>
-              <w:rFonts w:ascii="Cambria Math" w:hAnsi="Cambria Math" w:cs="Times New Roman"/>
-              <w:lang w:val="fr-MA"/>
-            </w:rPr>
-            <m:t>,</m:t>
-          </m:r>
-        </m:oMath>
-      </m:oMathPara>
-    </w:p>
-    <w:p>
-      <w:pPr>
-        <w:jc w:val="both"/>
-        <w:rPr>
-          <w:rFonts w:ascii="Times New Roman" w:hAnsi="Times New Roman" w:cs="Times New Roman"/>
-          <w:lang w:val="en-US"/>
-        </w:rPr>
-      </w:pPr>
+      <w:r>
+        <w:rPr>
+          <w:rFonts w:ascii="Times New Roman" w:hAnsi="Times New Roman" w:cs="Times New Roman"/>
+          <w:lang w:val="en-US"/>
+        </w:rPr>
+        <w:t xml:space="preserve"> </w:t>
+      </w:r>
+      <m:oMath>
+        <m:r>
+          <w:rPr>
+            <w:rFonts w:ascii="Cambria Math" w:hAnsi="Cambria Math" w:cs="Times New Roman"/>
+            <w:lang w:val="fr-MA"/>
+          </w:rPr>
+          <m:t>D</m:t>
+        </m:r>
+        <m:d>
+          <m:dPr>
+            <m:ctrlPr>
+              <w:rPr>
+                <w:rFonts w:ascii="Cambria Math" w:hAnsi="Cambria Math" w:cs="Times New Roman"/>
+                <w:lang w:val="fr-MA"/>
+              </w:rPr>
+            </m:ctrlPr>
+          </m:dPr>
+          <m:e>
+            <m:r>
+              <w:rPr>
+                <w:rFonts w:ascii="Cambria Math" w:hAnsi="Cambria Math" w:cs="Times New Roman"/>
+                <w:lang w:val="fr-MA"/>
+              </w:rPr>
+              <m:t>X</m:t>
+            </m:r>
+          </m:e>
+        </m:d>
+        <m:r>
+          <w:rPr>
+            <w:rFonts w:ascii="Cambria Math" w:hAnsi="Cambria Math" w:cs="Times New Roman"/>
+            <w:lang w:val="en-US"/>
+          </w:rPr>
+          <m:t>≤</m:t>
+        </m:r>
+        <m:d>
+          <m:dPr>
+            <m:ctrlPr>
+              <w:rPr>
+                <w:rFonts w:ascii="Cambria Math" w:hAnsi="Cambria Math" w:cs="Times New Roman"/>
+                <w:lang w:val="fr-MA"/>
+              </w:rPr>
+            </m:ctrlPr>
+          </m:dPr>
+          <m:e>
+            <m:r>
+              <w:rPr>
+                <w:rFonts w:ascii="Cambria Math" w:hAnsi="Cambria Math" w:cs="Times New Roman"/>
+                <w:lang w:val="en-US"/>
+              </w:rPr>
+              <m:t>1+</m:t>
+            </m:r>
+            <m:r>
+              <w:rPr>
+                <w:rFonts w:ascii="Cambria Math" w:hAnsi="Cambria Math" w:cs="Times New Roman"/>
+                <w:lang w:val="fr-MA"/>
+              </w:rPr>
+              <m:t>ε</m:t>
+            </m:r>
+          </m:e>
+        </m:d>
+        <m:sSub>
+          <m:sSubPr>
+            <m:ctrlPr>
+              <w:rPr>
+                <w:rFonts w:ascii="Cambria Math" w:hAnsi="Cambria Math" w:cs="Times New Roman"/>
+                <w:lang w:val="fr-MA"/>
+              </w:rPr>
+            </m:ctrlPr>
+          </m:sSubPr>
+          <m:e>
+            <m:r>
+              <w:rPr>
+                <w:rFonts w:ascii="Cambria Math" w:hAnsi="Cambria Math" w:cs="Times New Roman"/>
+                <w:lang w:val="fr-MA"/>
+              </w:rPr>
+              <m:t>D</m:t>
+            </m:r>
+          </m:e>
+          <m:sub>
+            <m:r>
+              <w:rPr>
+                <w:rFonts w:ascii="Cambria Math" w:hAnsi="Cambria Math" w:cs="Times New Roman"/>
+                <w:lang w:val="fr-MA"/>
+              </w:rPr>
+              <m:t>PR</m:t>
+            </m:r>
+          </m:sub>
+        </m:sSub>
+      </m:oMath>
+      <w:r>
+        <w:rPr>
+          <w:rFonts w:ascii="Times New Roman" w:hAnsi="Times New Roman" w:cs="Times New Roman"/>
+          <w:lang w:val="en-US"/>
+        </w:rPr>
+        <w:t xml:space="preserve">, </w:t>
+      </w:r>
       <w:r>
         <w:rPr>
           <w:rFonts w:ascii="Times New Roman" w:hAnsi="Times New Roman" w:cs="Times New Roman"/>
@@ -16067,26 +15786,31 @@
       </m:oMath>
       <w:r>
         <w:rPr>
-          <w:rFonts w:ascii="Times New Roman" w:hAnsi="Times New Roman" w:cs="Times New Roman"/>
-          <w:lang w:val="en-US"/>
-        </w:rPr>
-        <w:t>is a distance-tolerance parameter.</w:t>
-      </w:r>
-    </w:p>
-    <w:p>
-      <w:pPr>
-        <w:jc w:val="both"/>
-        <w:rPr>
-          <w:rFonts w:ascii="Times New Roman" w:hAnsi="Times New Roman" w:cs="Times New Roman"/>
-          <w:lang w:val="en-US"/>
-        </w:rPr>
-      </w:pPr>
-      <w:r>
-        <w:rPr>
-          <w:rFonts w:ascii="Times New Roman" w:hAnsi="Times New Roman" w:cs="Times New Roman"/>
-          <w:lang w:val="en-US"/>
-        </w:rPr>
-        <w:t>Among admissible Phase-II solutions, charging performance is compared lexicographically using</w:t>
+          <w:rFonts w:ascii="Times New Roman" w:eastAsiaTheme="minorEastAsia" w:hAnsi="Times New Roman" w:cs="Times New Roman"/>
+          <w:lang w:val="en-US"/>
+        </w:rPr>
+        <w:t xml:space="preserve"> </w:t>
+      </w:r>
+      <w:r>
+        <w:rPr>
+          <w:rFonts w:ascii="Times New Roman" w:hAnsi="Times New Roman" w:cs="Times New Roman"/>
+          <w:lang w:val="en-US"/>
+        </w:rPr>
+        <w:t>is a distance-tolerance parameter</w:t>
+      </w:r>
+      <w:r>
+        <w:rPr>
+          <w:rFonts w:ascii="Times New Roman" w:hAnsi="Times New Roman" w:cs="Times New Roman"/>
+          <w:lang w:val="en-US"/>
+        </w:rPr>
+        <w:t>, a</w:t>
+      </w:r>
+      <w:r>
+        <w:rPr>
+          <w:rFonts w:ascii="Times New Roman" w:hAnsi="Times New Roman" w:cs="Times New Roman"/>
+          <w:lang w:val="en-US"/>
+        </w:rPr>
+        <w:t>mong admissible Phase-II solutions, charging performance is compared lexicographically using</w:t>
       </w:r>
     </w:p>
     <w:p>
@@ -16134,14 +15858,7 @@
                       <w:rFonts w:ascii="Cambria Math" w:hAnsi="Cambria Math" w:cs="Times New Roman"/>
                       <w:lang w:val="fr-MA"/>
                     </w:rPr>
-                    <m:t>c</m:t>
-                  </m:r>
-                  <m:r>
-                    <w:rPr>
-                      <w:rFonts w:ascii="Cambria Math" w:hAnsi="Cambria Math" w:cs="Times New Roman"/>
-                      <w:lang w:val="fr-MA"/>
-                    </w:rPr>
-                    <m:t>h</m:t>
+                    <m:t>ch</m:t>
                   </m:r>
                 </m:sub>
               </m:sSub>
@@ -16201,14 +15918,7 @@
                       <w:rFonts w:ascii="Cambria Math" w:hAnsi="Cambria Math" w:cs="Times New Roman"/>
                       <w:lang w:val="fr-MA"/>
                     </w:rPr>
-                    <m:t>c</m:t>
-                  </m:r>
-                  <m:r>
-                    <w:rPr>
-                      <w:rFonts w:ascii="Cambria Math" w:hAnsi="Cambria Math" w:cs="Times New Roman"/>
-                      <w:lang w:val="fr-MA"/>
-                    </w:rPr>
-                    <m:t>h</m:t>
+                    <m:t>ch</m:t>
                   </m:r>
                 </m:sub>
               </m:sSub>
@@ -16223,13 +15933,6 @@
               </m:r>
             </m:e>
           </m:d>
-          <m:r>
-            <w:rPr>
-              <w:rFonts w:ascii="Cambria Math" w:hAnsi="Cambria Math" w:cs="Times New Roman"/>
-              <w:lang w:val="fr-MA"/>
-            </w:rPr>
-            <m:t>.</m:t>
-          </m:r>
         </m:oMath>
       </m:oMathPara>
     </w:p>
@@ -16295,7 +15998,6 @@
           <w:noProof/>
           <w:lang w:val="en-US"/>
         </w:rPr>
-        <w:lastRenderedPageBreak/>
         <w:drawing>
           <wp:inline distT="0" distB="0" distL="0" distR="0" wp14:anchorId="4927C0D0" wp14:editId="397D21F2">
             <wp:extent cx="5760720" cy="2062480"/>
@@ -16372,6 +16074,7 @@
           <w:rFonts w:ascii="Times New Roman" w:hAnsi="Times New Roman" w:cs="Times New Roman"/>
           <w:lang w:val="en-US"/>
         </w:rPr>
+        <w:lastRenderedPageBreak/>
         <w:t xml:space="preserve">Figure 1 summarizes the complete search structure. Phase I establishes </w:t>
       </w:r>
       <m:oMath>
@@ -17074,15 +16777,7 @@
                     <w:sz w:val="20"/>
                     <w:szCs w:val="20"/>
                   </w:rPr>
-                  <m:t>←</m:t>
-                </m:r>
-                <m:r>
-                  <w:rPr>
-                    <w:rFonts w:ascii="Cambria Math" w:eastAsia="Aptos" w:hAnsi="Cambria Math" w:cs="Times New Roman"/>
-                    <w:sz w:val="20"/>
-                    <w:szCs w:val="20"/>
-                  </w:rPr>
-                  <m:t>D</m:t>
+                  <m:t>←D</m:t>
                 </m:r>
                 <m:d>
                   <m:dPr>
@@ -17253,6 +16948,15 @@
                 </m:sup>
               </m:sSup>
             </m:oMath>
+            <w:r>
+              <w:rPr>
+                <w:rFonts w:ascii="Times New Roman" w:eastAsiaTheme="minorEastAsia" w:hAnsi="Times New Roman" w:cs="Times New Roman"/>
+                <w:sz w:val="20"/>
+                <w:szCs w:val="20"/>
+                <w:lang w:val="en-US"/>
+              </w:rPr>
+              <w:t xml:space="preserve"> </w:t>
+            </w:r>
             <w:r>
               <w:rPr>
                 <w:rFonts w:ascii="Times New Roman" w:hAnsi="Times New Roman" w:cs="Times New Roman"/>
@@ -18321,6 +18025,11 @@
     </w:p>
     <w:p>
       <w:pPr>
+        <w:pStyle w:val="Paragraphedeliste"/>
+        <w:numPr>
+          <w:ilvl w:val="1"/>
+          <w:numId w:val="25"/>
+        </w:numPr>
         <w:jc w:val="both"/>
         <w:rPr>
           <w:rFonts w:ascii="Times New Roman" w:hAnsi="Times New Roman" w:cs="Times New Roman"/>
@@ -18331,6 +18040,17 @@
           <w:lang w:val="en-US"/>
         </w:rPr>
       </w:pPr>
+      <w:r>
+        <w:rPr>
+          <w:rFonts w:ascii="Times New Roman" w:hAnsi="Times New Roman" w:cs="Times New Roman"/>
+          <w:b/>
+          <w:bCs/>
+          <w:i/>
+          <w:iCs/>
+          <w:lang w:val="en-US"/>
+        </w:rPr>
+        <w:t xml:space="preserve"> </w:t>
+      </w:r>
       <w:r>
         <w:rPr>
           <w:rFonts w:ascii="Times New Roman" w:hAnsi="Times New Roman" w:cs="Times New Roman"/>
@@ -18491,6 +18211,13 @@
       </m:oMath>
       <w:r>
         <w:rPr>
+          <w:rFonts w:ascii="Times New Roman" w:eastAsiaTheme="minorEastAsia" w:hAnsi="Times New Roman" w:cs="Times New Roman"/>
+          <w:lang w:val="en-US"/>
+        </w:rPr>
+        <w:t xml:space="preserve"> </w:t>
+      </w:r>
+      <w:r>
+        <w:rPr>
           <w:rFonts w:ascii="Times New Roman" w:hAnsi="Times New Roman" w:cs="Times New Roman"/>
           <w:lang w:val="en-US"/>
         </w:rPr>
@@ -18563,6 +18290,13 @@
           </m:sub>
         </m:sSub>
       </m:oMath>
+      <w:r>
+        <w:rPr>
+          <w:rFonts w:ascii="Times New Roman" w:eastAsiaTheme="minorEastAsia" w:hAnsi="Times New Roman" w:cs="Times New Roman"/>
+          <w:lang w:val="en-US"/>
+        </w:rPr>
+        <w:t xml:space="preserve"> </w:t>
+      </w:r>
       <w:r>
         <w:rPr>
           <w:rFonts w:ascii="Times New Roman" w:hAnsi="Times New Roman" w:cs="Times New Roman"/>
@@ -18586,7 +18320,6 @@
               <w:rFonts w:ascii="Cambria Math" w:hAnsi="Cambria Math" w:cs="Times New Roman"/>
               <w:lang w:val="fr-MA"/>
             </w:rPr>
-            <w:lastRenderedPageBreak/>
             <m:t>K</m:t>
           </m:r>
           <m:d>
@@ -18676,13 +18409,6 @@
               </m:sSub>
             </m:e>
           </m:d>
-          <m:r>
-            <w:rPr>
-              <w:rFonts w:ascii="Cambria Math" w:hAnsi="Cambria Math" w:cs="Times New Roman"/>
-              <w:lang w:val="fr-MA"/>
-            </w:rPr>
-            <m:t>,</m:t>
-          </m:r>
         </m:oMath>
       </m:oMathPara>
     </w:p>
@@ -18806,13 +18532,6 @@
               </m:sSub>
             </m:e>
           </m:d>
-          <m:r>
-            <w:rPr>
-              <w:rFonts w:ascii="Cambria Math" w:hAnsi="Cambria Math" w:cs="Times New Roman"/>
-              <w:lang w:val="fr-MA"/>
-            </w:rPr>
-            <m:t>.</m:t>
-          </m:r>
         </m:oMath>
       </m:oMathPara>
     </w:p>
@@ -18952,6 +18671,7 @@
                 <w:sz w:val="20"/>
                 <w:szCs w:val="20"/>
               </w:rPr>
+              <w:lastRenderedPageBreak/>
               <w:t>Input:</w:t>
             </w:r>
             <w:proofErr w:type="gramEnd"/>
@@ -20213,6 +19933,11 @@
     </w:p>
     <w:p>
       <w:pPr>
+        <w:pStyle w:val="Paragraphedeliste"/>
+        <w:numPr>
+          <w:ilvl w:val="1"/>
+          <w:numId w:val="25"/>
+        </w:numPr>
         <w:jc w:val="both"/>
         <w:rPr>
           <w:rFonts w:ascii="Times New Roman" w:hAnsi="Times New Roman" w:cs="Times New Roman"/>
@@ -20264,180 +19989,8 @@
           <w:rFonts w:ascii="Times New Roman" w:hAnsi="Times New Roman" w:cs="Times New Roman"/>
           <w:lang w:val="en-US"/>
         </w:rPr>
-        <w:t>When a route becomes battery-infeasible, HCO identifies the first infeasible route segment and builds candidate-station rankings according to</w:t>
-      </w:r>
-    </w:p>
-    <w:p>
-      <w:pPr>
-        <w:jc w:val="both"/>
-        <w:rPr>
-          <w:rFonts w:ascii="Times New Roman" w:hAnsi="Times New Roman" w:cs="Times New Roman"/>
-          <w:lang w:val="fr-MA"/>
-        </w:rPr>
-      </w:pPr>
-      <w:proofErr w:type="spellStart"/>
-      <m:oMathPara>
-        <m:oMath>
-          <m:r>
-            <m:rPr>
-              <m:nor/>
-            </m:rPr>
-            <w:rPr>
-              <w:rFonts w:ascii="Times New Roman" w:hAnsi="Times New Roman" w:cs="Times New Roman"/>
-              <w:lang w:val="fr-MA"/>
-            </w:rPr>
-            <m:t>detour</m:t>
-          </m:r>
-          <w:proofErr w:type="spellEnd"/>
-          <m:r>
-            <w:rPr>
-              <w:rFonts w:ascii="Cambria Math" w:hAnsi="Cambria Math" w:cs="Times New Roman"/>
-              <w:lang w:val="fr-MA"/>
-            </w:rPr>
-            <m:t>↑, </m:t>
-          </m:r>
-          <m:sSub>
-            <m:sSubPr>
-              <m:ctrlPr>
-                <w:rPr>
-                  <w:rFonts w:ascii="Cambria Math" w:hAnsi="Cambria Math" w:cs="Times New Roman"/>
-                  <w:lang w:val="fr-MA"/>
-                </w:rPr>
-              </m:ctrlPr>
-            </m:sSubPr>
-            <m:e>
-              <m:acc>
-                <m:accPr>
-                  <m:chr m:val="̅"/>
-                  <m:ctrlPr>
-                    <w:rPr>
-                      <w:rFonts w:ascii="Cambria Math" w:hAnsi="Cambria Math" w:cs="Times New Roman"/>
-                      <w:lang w:val="fr-MA"/>
-                    </w:rPr>
-                  </m:ctrlPr>
-                </m:accPr>
-                <m:e>
-                  <m:r>
-                    <w:rPr>
-                      <w:rFonts w:ascii="Cambria Math" w:hAnsi="Cambria Math" w:cs="Times New Roman"/>
-                      <w:lang w:val="fr-MA"/>
-                    </w:rPr>
-                    <m:t>P</m:t>
-                  </m:r>
-                </m:e>
-              </m:acc>
-            </m:e>
-            <m:sub>
-              <m:r>
-                <w:rPr>
-                  <w:rFonts w:ascii="Cambria Math" w:hAnsi="Cambria Math" w:cs="Times New Roman"/>
-                  <w:lang w:val="fr-MA"/>
-                </w:rPr>
-                <m:t>s</m:t>
-              </m:r>
-            </m:sub>
-          </m:sSub>
-          <m:r>
-            <w:rPr>
-              <w:rFonts w:ascii="Cambria Math" w:hAnsi="Cambria Math" w:cs="Times New Roman"/>
-              <w:lang w:val="fr-MA"/>
-            </w:rPr>
-            <m:t>↑, </m:t>
-          </m:r>
-          <m:sSub>
-            <m:sSubPr>
-              <m:ctrlPr>
-                <w:rPr>
-                  <w:rFonts w:ascii="Cambria Math" w:hAnsi="Cambria Math" w:cs="Times New Roman"/>
-                  <w:lang w:val="fr-MA"/>
-                </w:rPr>
-              </m:ctrlPr>
-            </m:sSubPr>
-            <m:e>
-              <m:acc>
-                <m:accPr>
-                  <m:chr m:val="̅"/>
-                  <m:ctrlPr>
-                    <w:rPr>
-                      <w:rFonts w:ascii="Cambria Math" w:hAnsi="Cambria Math" w:cs="Times New Roman"/>
-                      <w:lang w:val="fr-MA"/>
-                    </w:rPr>
-                  </m:ctrlPr>
-                </m:accPr>
-                <m:e>
-                  <m:r>
-                    <w:rPr>
-                      <w:rFonts w:ascii="Cambria Math" w:hAnsi="Cambria Math" w:cs="Times New Roman"/>
-                      <w:lang w:val="fr-MA"/>
-                    </w:rPr>
-                    <m:t>W</m:t>
-                  </m:r>
-                </m:e>
-              </m:acc>
-            </m:e>
-            <m:sub>
-              <m:r>
-                <w:rPr>
-                  <w:rFonts w:ascii="Cambria Math" w:hAnsi="Cambria Math" w:cs="Times New Roman"/>
-                  <w:lang w:val="fr-MA"/>
-                </w:rPr>
-                <m:t>s</m:t>
-              </m:r>
-            </m:sub>
-          </m:sSub>
-          <m:r>
-            <w:rPr>
-              <w:rFonts w:ascii="Cambria Math" w:hAnsi="Cambria Math" w:cs="Times New Roman"/>
-              <w:lang w:val="fr-MA"/>
-            </w:rPr>
-            <m:t>↑, </m:t>
-          </m:r>
-          <m:sSub>
-            <m:sSubPr>
-              <m:ctrlPr>
-                <w:rPr>
-                  <w:rFonts w:ascii="Cambria Math" w:hAnsi="Cambria Math" w:cs="Times New Roman"/>
-                  <w:lang w:val="fr-MA"/>
-                </w:rPr>
-              </m:ctrlPr>
-            </m:sSubPr>
-            <m:e>
-              <m:r>
-                <w:rPr>
-                  <w:rFonts w:ascii="Cambria Math" w:hAnsi="Cambria Math" w:cs="Times New Roman"/>
-                  <w:lang w:val="fr-MA"/>
-                </w:rPr>
-                <m:t>r</m:t>
-              </m:r>
-            </m:e>
-            <m:sub>
-              <m:r>
-                <w:rPr>
-                  <w:rFonts w:ascii="Cambria Math" w:hAnsi="Cambria Math" w:cs="Times New Roman"/>
-                  <w:lang w:val="fr-MA"/>
-                </w:rPr>
-                <m:t>s</m:t>
-              </m:r>
-            </m:sub>
-          </m:sSub>
-          <m:r>
-            <w:rPr>
-              <w:rFonts w:ascii="Cambria Math" w:hAnsi="Cambria Math" w:cs="Times New Roman"/>
-              <w:lang w:val="fr-MA"/>
-            </w:rPr>
-            <m:t>↓.</m:t>
-          </m:r>
-        </m:oMath>
-      </m:oMathPara>
-    </w:p>
-    <w:p>
-      <w:pPr>
-        <w:jc w:val="both"/>
-        <w:rPr>
-          <w:rFonts w:ascii="Times New Roman" w:hAnsi="Times New Roman" w:cs="Times New Roman"/>
-          <w:lang w:val="en-US"/>
-        </w:rPr>
-      </w:pPr>
+        <w:t xml:space="preserve">When a route becomes battery-infeasible, HCO identifies the first infeasible route segment and constructs four separate candidate-station rankings based on travel detour, expected electricity price, expected waiting time, and charging rate. Stations are ranked in ascending order of detour, expected price, and expected waiting time, and in descending order of charging rate. </w:t>
+      </w:r>
       <w:r>
         <w:rPr>
           <w:rFonts w:ascii="Times New Roman" w:hAnsi="Times New Roman" w:cs="Times New Roman"/>
@@ -20449,27 +20002,38 @@
         <m:r>
           <w:rPr>
             <w:rFonts w:ascii="Cambria Math" w:hAnsi="Cambria Math" w:cs="Times New Roman"/>
-            <w:lang w:val="fr-MA"/>
+            <w:lang w:val="en-US"/>
           </w:rPr>
           <m:t>k</m:t>
         </m:r>
       </m:oMath>
       <w:r>
         <w:rPr>
-          <w:rFonts w:ascii="Times New Roman" w:hAnsi="Times New Roman" w:cs="Times New Roman"/>
-          <w:lang w:val="en-US"/>
-        </w:rPr>
-        <w:t xml:space="preserve">stations from each ranking are combined, duplicate candidates are removed, and dominated candidates are discarded. In the final implementation, </w:t>
+          <w:rFonts w:ascii="Times New Roman" w:eastAsiaTheme="minorEastAsia" w:hAnsi="Times New Roman" w:cs="Times New Roman"/>
+          <w:iCs/>
+          <w:lang w:val="en-US"/>
+        </w:rPr>
+        <w:t xml:space="preserve"> </w:t>
+      </w:r>
+      <w:r>
+        <w:rPr>
+          <w:rFonts w:ascii="Times New Roman" w:hAnsi="Times New Roman" w:cs="Times New Roman"/>
+          <w:lang w:val="en-US"/>
+        </w:rPr>
+        <w:t xml:space="preserve">stations from each ranking are combined, duplicate candidates are removed, and dominated candidates are discarded. In the final implementation </w:t>
       </w:r>
       <m:oMath>
         <m:r>
           <w:rPr>
             <w:rFonts w:ascii="Cambria Math" w:hAnsi="Cambria Math" w:cs="Times New Roman"/>
-            <w:lang w:val="fr-MA"/>
+            <w:lang w:val="en-US"/>
           </w:rPr>
           <m:t>k</m:t>
         </m:r>
         <m:r>
+          <m:rPr>
+            <m:sty m:val="p"/>
+          </m:rPr>
           <w:rPr>
             <w:rFonts w:ascii="Cambria Math" w:hAnsi="Cambria Math" w:cs="Times New Roman"/>
             <w:lang w:val="en-US"/>
@@ -20490,7 +20054,7 @@
         <w:jc w:val="both"/>
         <w:rPr>
           <w:rFonts w:ascii="Times New Roman" w:hAnsi="Times New Roman" w:cs="Times New Roman"/>
-          <w:lang w:val="fr-MA"/>
+          <w:lang w:val="en-US"/>
         </w:rPr>
       </w:pPr>
       <w:r>
@@ -20537,222 +20101,167 @@
         </w:rPr>
         <w:t xml:space="preserve">. </w:t>
       </w:r>
-      <w:proofErr w:type="spellStart"/>
-      <w:r>
-        <w:rPr>
-          <w:rFonts w:ascii="Times New Roman" w:hAnsi="Times New Roman" w:cs="Times New Roman"/>
-          <w:lang w:val="fr-MA"/>
-        </w:rPr>
-        <w:t>Feasible</w:t>
-      </w:r>
-      <w:proofErr w:type="spellEnd"/>
-      <w:r>
-        <w:rPr>
-          <w:rFonts w:ascii="Times New Roman" w:hAnsi="Times New Roman" w:cs="Times New Roman"/>
-          <w:lang w:val="fr-MA"/>
+      <w:r>
+        <w:rPr>
+          <w:rFonts w:ascii="Times New Roman" w:hAnsi="Times New Roman" w:cs="Times New Roman"/>
+          <w:lang w:val="en-US"/>
+        </w:rPr>
+        <w:t>Feasible charging alternatives are compared using</w:t>
+      </w:r>
+      <w:r>
+        <w:rPr>
+          <w:rFonts w:ascii="Times New Roman" w:hAnsi="Times New Roman" w:cs="Times New Roman"/>
+          <w:lang w:val="en-US"/>
         </w:rPr>
         <w:t xml:space="preserve"> </w:t>
       </w:r>
-      <w:proofErr w:type="spellStart"/>
-      <w:r>
-        <w:rPr>
-          <w:rFonts w:ascii="Times New Roman" w:hAnsi="Times New Roman" w:cs="Times New Roman"/>
-          <w:lang w:val="fr-MA"/>
-        </w:rPr>
-        <w:t>charging</w:t>
-      </w:r>
-      <w:proofErr w:type="spellEnd"/>
-      <w:r>
-        <w:rPr>
-          <w:rFonts w:ascii="Times New Roman" w:hAnsi="Times New Roman" w:cs="Times New Roman"/>
-          <w:lang w:val="fr-MA"/>
-        </w:rPr>
-        <w:t xml:space="preserve"> alternatives are </w:t>
-      </w:r>
-      <w:proofErr w:type="spellStart"/>
-      <w:r>
-        <w:rPr>
-          <w:rFonts w:ascii="Times New Roman" w:hAnsi="Times New Roman" w:cs="Times New Roman"/>
-          <w:lang w:val="fr-MA"/>
-        </w:rPr>
-        <w:t>compared</w:t>
-      </w:r>
-      <w:proofErr w:type="spellEnd"/>
-      <w:r>
-        <w:rPr>
-          <w:rFonts w:ascii="Times New Roman" w:hAnsi="Times New Roman" w:cs="Times New Roman"/>
-          <w:lang w:val="fr-MA"/>
-        </w:rPr>
-        <w:t xml:space="preserve"> </w:t>
-      </w:r>
-      <w:proofErr w:type="spellStart"/>
-      <w:r>
-        <w:rPr>
-          <w:rFonts w:ascii="Times New Roman" w:hAnsi="Times New Roman" w:cs="Times New Roman"/>
-          <w:lang w:val="fr-MA"/>
-        </w:rPr>
-        <w:t>using</w:t>
-      </w:r>
-      <w:proofErr w:type="spellEnd"/>
+      <m:oMath>
+        <m:d>
+          <m:dPr>
+            <m:sepChr m:val=","/>
+            <m:ctrlPr>
+              <w:rPr>
+                <w:rFonts w:ascii="Cambria Math" w:hAnsi="Cambria Math" w:cs="Times New Roman"/>
+                <w:lang w:val="fr-MA"/>
+              </w:rPr>
+            </m:ctrlPr>
+          </m:dPr>
+          <m:e>
+            <m:sSub>
+              <m:sSubPr>
+                <m:ctrlPr>
+                  <w:rPr>
+                    <w:rFonts w:ascii="Cambria Math" w:hAnsi="Cambria Math" w:cs="Times New Roman"/>
+                    <w:lang w:val="fr-MA"/>
+                  </w:rPr>
+                </m:ctrlPr>
+              </m:sSubPr>
+              <m:e>
+                <m:r>
+                  <w:rPr>
+                    <w:rFonts w:ascii="Cambria Math" w:hAnsi="Cambria Math" w:cs="Times New Roman"/>
+                    <w:lang w:val="fr-MA"/>
+                  </w:rPr>
+                  <m:t>C</m:t>
+                </m:r>
+              </m:e>
+              <m:sub>
+                <m:r>
+                  <w:rPr>
+                    <w:rFonts w:ascii="Cambria Math" w:hAnsi="Cambria Math" w:cs="Times New Roman"/>
+                    <w:lang w:val="fr-MA"/>
+                  </w:rPr>
+                  <m:t>c</m:t>
+                </m:r>
+                <m:r>
+                  <w:rPr>
+                    <w:rFonts w:ascii="Cambria Math" w:hAnsi="Cambria Math" w:cs="Times New Roman"/>
+                    <w:lang w:val="en-US"/>
+                  </w:rPr>
+                  <m:t>h</m:t>
+                </m:r>
+              </m:sub>
+            </m:sSub>
+          </m:e>
+          <m:e>
+            <m:sSub>
+              <m:sSubPr>
+                <m:ctrlPr>
+                  <w:rPr>
+                    <w:rFonts w:ascii="Cambria Math" w:hAnsi="Cambria Math" w:cs="Times New Roman"/>
+                    <w:lang w:val="fr-MA"/>
+                  </w:rPr>
+                </m:ctrlPr>
+              </m:sSubPr>
+              <m:e>
+                <m:r>
+                  <w:rPr>
+                    <w:rFonts w:ascii="Cambria Math" w:hAnsi="Cambria Math" w:cs="Times New Roman"/>
+                    <w:lang w:val="fr-MA"/>
+                  </w:rPr>
+                  <m:t>T</m:t>
+                </m:r>
+              </m:e>
+              <m:sub>
+                <m:r>
+                  <w:rPr>
+                    <w:rFonts w:ascii="Cambria Math" w:hAnsi="Cambria Math" w:cs="Times New Roman"/>
+                    <w:lang w:val="fr-MA"/>
+                  </w:rPr>
+                  <m:t>wait</m:t>
+                </m:r>
+              </m:sub>
+            </m:sSub>
+          </m:e>
+          <m:e>
+            <m:sSub>
+              <m:sSubPr>
+                <m:ctrlPr>
+                  <w:rPr>
+                    <w:rFonts w:ascii="Cambria Math" w:hAnsi="Cambria Math" w:cs="Times New Roman"/>
+                    <w:lang w:val="fr-MA"/>
+                  </w:rPr>
+                </m:ctrlPr>
+              </m:sSubPr>
+              <m:e>
+                <m:r>
+                  <w:rPr>
+                    <w:rFonts w:ascii="Cambria Math" w:hAnsi="Cambria Math" w:cs="Times New Roman"/>
+                    <w:lang w:val="fr-MA"/>
+                  </w:rPr>
+                  <m:t>T</m:t>
+                </m:r>
+              </m:e>
+              <m:sub>
+                <m:r>
+                  <w:rPr>
+                    <w:rFonts w:ascii="Cambria Math" w:hAnsi="Cambria Math" w:cs="Times New Roman"/>
+                    <w:lang w:val="fr-MA"/>
+                  </w:rPr>
+                  <m:t>c</m:t>
+                </m:r>
+                <m:r>
+                  <w:rPr>
+                    <w:rFonts w:ascii="Cambria Math" w:hAnsi="Cambria Math" w:cs="Times New Roman"/>
+                    <w:lang w:val="en-US"/>
+                  </w:rPr>
+                  <m:t>h</m:t>
+                </m:r>
+              </m:sub>
+            </m:sSub>
+          </m:e>
+          <m:e>
+            <m:r>
+              <w:rPr>
+                <w:rFonts w:ascii="Cambria Math" w:hAnsi="Cambria Math" w:cs="Times New Roman"/>
+                <w:lang w:val="fr-MA"/>
+              </w:rPr>
+              <m:t>D</m:t>
+            </m:r>
+          </m:e>
+        </m:d>
+      </m:oMath>
+      <w:r>
+        <w:rPr>
+          <w:rFonts w:ascii="Times New Roman" w:eastAsiaTheme="minorEastAsia" w:hAnsi="Times New Roman" w:cs="Times New Roman"/>
+          <w:lang w:val="en-US"/>
+        </w:rPr>
+        <w:t>.</w:t>
+      </w:r>
     </w:p>
     <w:p>
       <w:pPr>
         <w:jc w:val="both"/>
         <w:rPr>
           <w:rFonts w:ascii="Times New Roman" w:hAnsi="Times New Roman" w:cs="Times New Roman"/>
-          <w:lang w:val="fr-MA"/>
-        </w:rPr>
-      </w:pPr>
-      <m:oMathPara>
-        <m:oMath>
-          <m:d>
-            <m:dPr>
-              <m:sepChr m:val=","/>
-              <m:ctrlPr>
-                <w:rPr>
-                  <w:rFonts w:ascii="Cambria Math" w:hAnsi="Cambria Math" w:cs="Times New Roman"/>
-                  <w:lang w:val="fr-MA"/>
-                </w:rPr>
-              </m:ctrlPr>
-            </m:dPr>
-            <m:e>
-              <m:sSub>
-                <m:sSubPr>
-                  <m:ctrlPr>
-                    <w:rPr>
-                      <w:rFonts w:ascii="Cambria Math" w:hAnsi="Cambria Math" w:cs="Times New Roman"/>
-                      <w:lang w:val="fr-MA"/>
-                    </w:rPr>
-                  </m:ctrlPr>
-                </m:sSubPr>
-                <m:e>
-                  <m:r>
-                    <w:rPr>
-                      <w:rFonts w:ascii="Cambria Math" w:hAnsi="Cambria Math" w:cs="Times New Roman"/>
-                      <w:lang w:val="fr-MA"/>
-                    </w:rPr>
-                    <m:t>C</m:t>
-                  </m:r>
-                </m:e>
-                <m:sub>
-                  <m:r>
-                    <w:rPr>
-                      <w:rFonts w:ascii="Cambria Math" w:hAnsi="Cambria Math" w:cs="Times New Roman"/>
-                      <w:lang w:val="fr-MA"/>
-                    </w:rPr>
-                    <m:t>c</m:t>
-                  </m:r>
-                  <m:r>
-                    <w:rPr>
-                      <w:rFonts w:ascii="Cambria Math" w:hAnsi="Cambria Math" w:cs="Times New Roman"/>
-                      <w:lang w:val="fr-MA"/>
-                    </w:rPr>
-                    <m:t>h</m:t>
-                  </m:r>
-                </m:sub>
-              </m:sSub>
-            </m:e>
-            <m:e>
-              <m:sSub>
-                <m:sSubPr>
-                  <m:ctrlPr>
-                    <w:rPr>
-                      <w:rFonts w:ascii="Cambria Math" w:hAnsi="Cambria Math" w:cs="Times New Roman"/>
-                      <w:lang w:val="fr-MA"/>
-                    </w:rPr>
-                  </m:ctrlPr>
-                </m:sSubPr>
-                <m:e>
-                  <m:r>
-                    <w:rPr>
-                      <w:rFonts w:ascii="Cambria Math" w:hAnsi="Cambria Math" w:cs="Times New Roman"/>
-                      <w:lang w:val="fr-MA"/>
-                    </w:rPr>
-                    <m:t>T</m:t>
-                  </m:r>
-                </m:e>
-                <m:sub>
-                  <m:r>
-                    <w:rPr>
-                      <w:rFonts w:ascii="Cambria Math" w:hAnsi="Cambria Math" w:cs="Times New Roman"/>
-                      <w:lang w:val="fr-MA"/>
-                    </w:rPr>
-                    <m:t>wait</m:t>
-                  </m:r>
-                </m:sub>
-              </m:sSub>
-            </m:e>
-            <m:e>
-              <m:sSub>
-                <m:sSubPr>
-                  <m:ctrlPr>
-                    <w:rPr>
-                      <w:rFonts w:ascii="Cambria Math" w:hAnsi="Cambria Math" w:cs="Times New Roman"/>
-                      <w:lang w:val="fr-MA"/>
-                    </w:rPr>
-                  </m:ctrlPr>
-                </m:sSubPr>
-                <m:e>
-                  <m:r>
-                    <w:rPr>
-                      <w:rFonts w:ascii="Cambria Math" w:hAnsi="Cambria Math" w:cs="Times New Roman"/>
-                      <w:lang w:val="fr-MA"/>
-                    </w:rPr>
-                    <m:t>T</m:t>
-                  </m:r>
-                </m:e>
-                <m:sub>
-                  <m:r>
-                    <w:rPr>
-                      <w:rFonts w:ascii="Cambria Math" w:hAnsi="Cambria Math" w:cs="Times New Roman"/>
-                      <w:lang w:val="fr-MA"/>
-                    </w:rPr>
-                    <m:t>c</m:t>
-                  </m:r>
-                  <m:r>
-                    <w:rPr>
-                      <w:rFonts w:ascii="Cambria Math" w:hAnsi="Cambria Math" w:cs="Times New Roman"/>
-                      <w:lang w:val="fr-MA"/>
-                    </w:rPr>
-                    <m:t>h</m:t>
-                  </m:r>
-                </m:sub>
-              </m:sSub>
-            </m:e>
-            <m:e>
-              <m:r>
-                <w:rPr>
-                  <w:rFonts w:ascii="Cambria Math" w:hAnsi="Cambria Math" w:cs="Times New Roman"/>
-                  <w:lang w:val="fr-MA"/>
-                </w:rPr>
-                <m:t>D</m:t>
-              </m:r>
-            </m:e>
-          </m:d>
-          <m:r>
-            <w:rPr>
-              <w:rFonts w:ascii="Cambria Math" w:hAnsi="Cambria Math" w:cs="Times New Roman"/>
-              <w:lang w:val="fr-MA"/>
-            </w:rPr>
-            <m:t>.</m:t>
-          </m:r>
-        </m:oMath>
-      </m:oMathPara>
-    </w:p>
-    <w:p>
-      <w:pPr>
-        <w:jc w:val="both"/>
-        <w:rPr>
-          <w:rFonts w:ascii="Times New Roman" w:hAnsi="Times New Roman" w:cs="Times New Roman"/>
-          <w:lang w:val="en-US"/>
-        </w:rPr>
-      </w:pPr>
-      <w:r>
-        <w:rPr>
-          <w:rFonts w:ascii="Times New Roman" w:hAnsi="Times New Roman" w:cs="Times New Roman"/>
-          <w:lang w:val="en-US"/>
-        </w:rPr>
-        <w:lastRenderedPageBreak/>
+          <w:lang w:val="en-US"/>
+        </w:rPr>
+      </w:pPr>
+      <w:r>
+        <w:rPr>
+          <w:rFonts w:ascii="Times New Roman" w:hAnsi="Times New Roman" w:cs="Times New Roman"/>
+          <w:lang w:val="en-US"/>
+        </w:rPr>
         <w:t xml:space="preserve">After a feasible charging plan is constructed, the oracle may test station removal or replacement. A modified plan is retained only when feasibility is </w:t>
       </w:r>
       <w:proofErr w:type="gramStart"/>
@@ -21042,6 +20551,7 @@
                 <w:szCs w:val="20"/>
                 <w:lang w:val="en-US"/>
               </w:rPr>
+              <w:lastRenderedPageBreak/>
               <w:t>Output:</w:t>
             </w:r>
             <w:r>
@@ -22660,6 +22170,11 @@
     </w:p>
     <w:p>
       <w:pPr>
+        <w:pStyle w:val="Paragraphedeliste"/>
+        <w:numPr>
+          <w:ilvl w:val="1"/>
+          <w:numId w:val="25"/>
+        </w:numPr>
         <w:jc w:val="both"/>
         <w:rPr>
           <w:rFonts w:ascii="Times New Roman" w:hAnsi="Times New Roman" w:cs="Times New Roman"/>
@@ -22727,6 +22242,13 @@
           </m:sup>
         </m:sSup>
       </m:oMath>
+      <w:r>
+        <w:rPr>
+          <w:rFonts w:ascii="Times New Roman" w:eastAsiaTheme="minorEastAsia" w:hAnsi="Times New Roman" w:cs="Times New Roman"/>
+          <w:lang w:val="en-US"/>
+        </w:rPr>
+        <w:t xml:space="preserve"> </w:t>
+      </w:r>
       <w:r>
         <w:rPr>
           <w:rFonts w:ascii="Times New Roman" w:hAnsi="Times New Roman" w:cs="Times New Roman"/>
@@ -22780,6 +22302,13 @@
       </m:oMath>
       <w:r>
         <w:rPr>
+          <w:rFonts w:ascii="Times New Roman" w:eastAsiaTheme="minorEastAsia" w:hAnsi="Times New Roman" w:cs="Times New Roman"/>
+          <w:lang w:val="en-US"/>
+        </w:rPr>
+        <w:t xml:space="preserve"> </w:t>
+      </w:r>
+      <w:r>
+        <w:rPr>
           <w:rFonts w:ascii="Times New Roman" w:hAnsi="Times New Roman" w:cs="Times New Roman"/>
           <w:lang w:val="en-US"/>
         </w:rPr>
@@ -22815,15 +22344,7 @@
           <w:rFonts w:ascii="Times New Roman" w:hAnsi="Times New Roman" w:cs="Times New Roman"/>
           <w:lang w:val="en-US"/>
         </w:rPr>
-        <w:t xml:space="preserve">The main difference from Phase I is that HCO is integrated directly into customer reinsertion. For each removed customer, the method first generates several promising insertion alternatives. </w:t>
-      </w:r>
-      <w:r>
-        <w:rPr>
-          <w:rFonts w:ascii="Times New Roman" w:hAnsi="Times New Roman" w:cs="Times New Roman"/>
-          <w:lang w:val="en-US"/>
-        </w:rPr>
-        <w:lastRenderedPageBreak/>
-        <w:t>A short list of the best candidates is retained; the final implementation uses five alternatives. HCO then evaluates the affected route for each shortlisted insertion, and the best HCO-evaluated alternative is selected. Charging information can therefore influence the reinsertion decision itself rather than being applied only after the customer route has already been fixed.</w:t>
+        <w:t>The main difference from Phase I is that HCO is integrated directly into customer reinsertion. For each removed customer, the method first generates several promising insertion alternatives. A short list of the best candidates is retained; the final implementation uses five alternatives. HCO then evaluates the affected route for each shortlisted insertion, and the best HCO-evaluated alternative is selected. Charging information can therefore influence the reinsertion decision itself rather than being applied only after the customer route has already been fixed.</w:t>
       </w:r>
     </w:p>
     <w:p>
@@ -22969,13 +22490,6 @@
               </m:r>
             </m:sub>
           </m:sSub>
-          <m:r>
-            <w:rPr>
-              <w:rFonts w:ascii="Cambria Math" w:hAnsi="Cambria Math" w:cs="Times New Roman"/>
-              <w:lang w:val="fr-MA"/>
-            </w:rPr>
-            <m:t>.</m:t>
-          </m:r>
         </m:oMath>
       </m:oMathPara>
     </w:p>
@@ -23040,14 +22554,7 @@
                       <w:rFonts w:ascii="Cambria Math" w:hAnsi="Cambria Math" w:cs="Times New Roman"/>
                       <w:lang w:val="fr-MA"/>
                     </w:rPr>
-                    <m:t>c</m:t>
-                  </m:r>
-                  <m:r>
-                    <w:rPr>
-                      <w:rFonts w:ascii="Cambria Math" w:hAnsi="Cambria Math" w:cs="Times New Roman"/>
-                      <w:lang w:val="fr-MA"/>
-                    </w:rPr>
-                    <m:t>h</m:t>
+                    <m:t>ch</m:t>
                   </m:r>
                 </m:sub>
               </m:sSub>
@@ -23107,14 +22614,7 @@
                       <w:rFonts w:ascii="Cambria Math" w:hAnsi="Cambria Math" w:cs="Times New Roman"/>
                       <w:lang w:val="fr-MA"/>
                     </w:rPr>
-                    <m:t>c</m:t>
-                  </m:r>
-                  <m:r>
-                    <w:rPr>
-                      <w:rFonts w:ascii="Cambria Math" w:hAnsi="Cambria Math" w:cs="Times New Roman"/>
-                      <w:lang w:val="fr-MA"/>
-                    </w:rPr>
-                    <m:t>h</m:t>
+                    <m:t>ch</m:t>
                   </m:r>
                 </m:sub>
               </m:sSub>
@@ -23129,13 +22629,6 @@
               </m:r>
             </m:e>
           </m:d>
-          <m:r>
-            <w:rPr>
-              <w:rFonts w:ascii="Cambria Math" w:hAnsi="Cambria Math" w:cs="Times New Roman"/>
-              <w:lang w:val="fr-MA"/>
-            </w:rPr>
-            <m:t>.</m:t>
-          </m:r>
         </m:oMath>
       </m:oMathPara>
     </w:p>
@@ -23170,6 +22663,7 @@
           <w:rFonts w:ascii="Times New Roman" w:hAnsi="Times New Roman" w:cs="Times New Roman"/>
           <w:lang w:val="en-US"/>
         </w:rPr>
+        <w:lastRenderedPageBreak/>
         <w:t xml:space="preserve">At the end of Phase II, the best retained solution undergoes a final non-worsening HCO refinement and complete feasibility replay. The validated solution is returned as </w:t>
       </w:r>
       <m:oMath>
@@ -24127,39 +23621,47 @@
                 <w:szCs w:val="20"/>
                 <w:lang w:val="en-US"/>
               </w:rPr>
-              <w:t>Replay the complete candidate X</w:t>
-            </w:r>
-            <w:proofErr w:type="gramStart"/>
-            <w:r>
-              <w:rPr>
-                <w:rFonts w:ascii="Times New Roman" w:hAnsi="Times New Roman" w:cs="Times New Roman"/>
-                <w:sz w:val="20"/>
-                <w:szCs w:val="20"/>
-                <w:lang w:val="en-US"/>
-              </w:rPr>
-              <w:t>^{</w:t>
-            </w:r>
-            <w:proofErr w:type="gramEnd"/>
-            <w:r>
-              <w:rPr>
-                <w:rFonts w:ascii="Times New Roman" w:hAnsi="Times New Roman" w:cs="Times New Roman"/>
-                <w:sz w:val="20"/>
-                <w:szCs w:val="20"/>
-                <w:lang w:val="en-US"/>
-              </w:rPr>
-              <w:t>\</w:t>
-            </w:r>
-            <w:proofErr w:type="gramStart"/>
-            <w:r>
-              <w:rPr>
-                <w:rFonts w:ascii="Times New Roman" w:hAnsi="Times New Roman" w:cs="Times New Roman"/>
-                <w:sz w:val="20"/>
-                <w:szCs w:val="20"/>
-                <w:lang w:val="en-US"/>
-              </w:rPr>
-              <w:t>prime }</w:t>
-            </w:r>
-            <w:proofErr w:type="gramEnd"/>
+              <w:t xml:space="preserve">Replay the complete candidate </w:t>
+            </w:r>
+            <m:oMath>
+              <m:sSup>
+                <m:sSupPr>
+                  <m:ctrlPr>
+                    <w:rPr>
+                      <w:rFonts w:ascii="Cambria Math" w:hAnsi="Cambria Math" w:cs="Times New Roman"/>
+                      <w:sz w:val="20"/>
+                      <w:szCs w:val="20"/>
+                      <w:lang w:val="en-US"/>
+                    </w:rPr>
+                  </m:ctrlPr>
+                </m:sSupPr>
+                <m:e>
+                  <m:r>
+                    <w:rPr>
+                      <w:rFonts w:ascii="Cambria Math" w:hAnsi="Cambria Math" w:cs="Times New Roman"/>
+                      <w:sz w:val="20"/>
+                      <w:szCs w:val="20"/>
+                      <w:lang w:val="en-US"/>
+                    </w:rPr>
+                    <m:t>X</m:t>
+                  </m:r>
+                </m:e>
+                <m:sup>
+                  <m:r>
+                    <m:rPr>
+                      <m:sty m:val="p"/>
+                    </m:rPr>
+                    <w:rPr>
+                      <w:rFonts w:ascii="Cambria Math" w:hAnsi="Cambria Math" w:cs="Times New Roman"/>
+                      <w:sz w:val="20"/>
+                      <w:szCs w:val="20"/>
+                      <w:lang w:val="en-US"/>
+                    </w:rPr>
+                    <m:t>'</m:t>
+                  </m:r>
+                </m:sup>
+              </m:sSup>
+            </m:oMath>
           </w:p>
         </w:tc>
       </w:tr>
@@ -24810,6 +24312,15 @@
             </m:oMath>
             <w:r>
               <w:rPr>
+                <w:rFonts w:ascii="Times New Roman" w:eastAsiaTheme="minorEastAsia" w:hAnsi="Times New Roman" w:cs="Times New Roman"/>
+                <w:sz w:val="20"/>
+                <w:szCs w:val="20"/>
+                <w:lang w:val="en-US"/>
+              </w:rPr>
+              <w:t xml:space="preserve"> </w:t>
+            </w:r>
+            <w:r>
+              <w:rPr>
                 <w:rFonts w:ascii="Times New Roman" w:hAnsi="Times New Roman" w:cs="Times New Roman"/>
                 <w:sz w:val="20"/>
                 <w:szCs w:val="20"/>
@@ -25376,6 +24887,11 @@
     </w:p>
     <w:p>
       <w:pPr>
+        <w:pStyle w:val="Paragraphedeliste"/>
+        <w:numPr>
+          <w:ilvl w:val="0"/>
+          <w:numId w:val="25"/>
+        </w:numPr>
         <w:jc w:val="both"/>
         <w:rPr>
           <w:rFonts w:ascii="Times New Roman" w:hAnsi="Times New Roman" w:cs="Times New Roman"/>
@@ -25427,6 +24943,11 @@
     </w:p>
     <w:p>
       <w:pPr>
+        <w:pStyle w:val="Paragraphedeliste"/>
+        <w:numPr>
+          <w:ilvl w:val="1"/>
+          <w:numId w:val="25"/>
+        </w:numPr>
         <w:jc w:val="both"/>
         <w:rPr>
           <w:rFonts w:ascii="Times New Roman" w:hAnsi="Times New Roman" w:cs="Times New Roman"/>
@@ -25446,7 +24967,6 @@
           <w:iCs/>
           <w:lang w:val="en-US"/>
         </w:rPr>
-        <w:lastRenderedPageBreak/>
         <w:t>Benchmark and Experimental Setup</w:t>
       </w:r>
     </w:p>
@@ -25552,7 +25072,15 @@
           <w:rFonts w:ascii="Times New Roman" w:hAnsi="Times New Roman" w:cs="Times New Roman"/>
           <w:lang w:val="en-US"/>
         </w:rPr>
-        <w:t>, is generated once and stored. All fixed-route HCO and Phase-II variants start from this same solution. This ensures that differences among these variants are caused by the charging treatment or Phase-II search rather than by different Phase-I starting solutions. Phase II receives an additional 15 s, giving the complete two-phase method a total nominal budget of 30 s.</w:t>
+        <w:t xml:space="preserve">, is generated once and stored. All fixed-route HCO and </w:t>
+      </w:r>
+      <w:r>
+        <w:rPr>
+          <w:rFonts w:ascii="Times New Roman" w:hAnsi="Times New Roman" w:cs="Times New Roman"/>
+          <w:lang w:val="en-US"/>
+        </w:rPr>
+        <w:lastRenderedPageBreak/>
+        <w:t>Phase-II variants start from this same solution. This ensures that differences among these variants are caused by the charging treatment or Phase-II search rather than by different Phase-I starting solutions. Phase II receives an additional 15 s, giving the complete two-phase method a total nominal budget of 30 s.</w:t>
       </w:r>
     </w:p>
     <w:p>
@@ -26262,6 +25790,11 @@
     </w:p>
     <w:p>
       <w:pPr>
+        <w:pStyle w:val="Paragraphedeliste"/>
+        <w:numPr>
+          <w:ilvl w:val="1"/>
+          <w:numId w:val="25"/>
+        </w:numPr>
         <w:jc w:val="both"/>
         <w:rPr>
           <w:rFonts w:ascii="Times New Roman" w:hAnsi="Times New Roman" w:cs="Times New Roman"/>
@@ -26297,15 +25830,7 @@
           <w:rFonts w:ascii="Times New Roman" w:hAnsi="Times New Roman" w:cs="Times New Roman"/>
           <w:lang w:val="en-US"/>
         </w:rPr>
-        <w:t>Table 3 reports the overall routing performance of the baseline methods. The ALNS variants produce the smallest mean fleet sizes in both time-window regimes. Under Original TW, ALNS-</w:t>
-      </w:r>
-      <w:r>
-        <w:rPr>
-          <w:rFonts w:ascii="Times New Roman" w:hAnsi="Times New Roman" w:cs="Times New Roman"/>
-          <w:lang w:val="en-US"/>
-        </w:rPr>
-        <w:lastRenderedPageBreak/>
-        <w:t>FR obtains a mean fleet size of 69.96 and the shortest mean distance of 47,363.0, while ALNS-PR obtains the shortest mean route duration of 169,554.7. Under Relaxed TW, ALNS-FR and ALNS-PR again produce similar fleet and duration results, while VNS obtains the shortest mean travel distance. These results show that the two ALNS recharge policies provide comparable routing quality, making their charging-related differences particularly informative.</w:t>
+        <w:t>Table 3 reports the overall routing performance of the baseline methods. The ALNS variants produce the smallest mean fleet sizes in both time-window regimes. Under Original TW, ALNS-FR obtains a mean fleet size of 69.96 and the shortest mean distance of 47,363.0, while ALNS-PR obtains the shortest mean route duration of 169,554.7. Under Relaxed TW, ALNS-FR and ALNS-PR again produce similar fleet and duration results, while VNS obtains the shortest mean travel distance. These results show that the two ALNS recharge policies provide comparable routing quality, making their charging-related differences particularly informative.</w:t>
       </w:r>
     </w:p>
     <w:p>
@@ -26553,6 +26078,7 @@
         <w:tc>
           <w:tcPr>
             <w:tcW w:w="0" w:type="auto"/>
+            <w:vMerge w:val="restart"/>
             <w:hideMark/>
           </w:tcPr>
           <w:p>
@@ -26595,6 +26121,14 @@
                 <w:szCs w:val="20"/>
               </w:rPr>
               <w:t>GI</w:t>
+            </w:r>
+            <w:r>
+              <w:rPr>
+                <w:rFonts w:ascii="Times New Roman" w:hAnsi="Times New Roman" w:cs="Times New Roman"/>
+                <w:sz w:val="20"/>
+                <w:szCs w:val="20"/>
+              </w:rPr>
+              <w:t xml:space="preserve"> </w:t>
             </w:r>
           </w:p>
         </w:tc>
@@ -26702,6 +26236,7 @@
         <w:tc>
           <w:tcPr>
             <w:tcW w:w="0" w:type="auto"/>
+            <w:vMerge/>
             <w:hideMark/>
           </w:tcPr>
           <w:p>
@@ -26843,6 +26378,7 @@
         <w:tc>
           <w:tcPr>
             <w:tcW w:w="0" w:type="auto"/>
+            <w:vMerge/>
             <w:hideMark/>
           </w:tcPr>
           <w:p>
@@ -26984,6 +26520,7 @@
         <w:tc>
           <w:tcPr>
             <w:tcW w:w="0" w:type="auto"/>
+            <w:vMerge/>
             <w:hideMark/>
           </w:tcPr>
           <w:p>
@@ -27125,6 +26662,7 @@
         <w:tc>
           <w:tcPr>
             <w:tcW w:w="0" w:type="auto"/>
+            <w:vMerge/>
             <w:hideMark/>
           </w:tcPr>
           <w:p>
@@ -27266,6 +26804,7 @@
         <w:tc>
           <w:tcPr>
             <w:tcW w:w="0" w:type="auto"/>
+            <w:vMerge w:val="restart"/>
             <w:hideMark/>
           </w:tcPr>
           <w:p>
@@ -27417,6 +26956,7 @@
         <w:tc>
           <w:tcPr>
             <w:tcW w:w="0" w:type="auto"/>
+            <w:vMerge/>
             <w:hideMark/>
           </w:tcPr>
           <w:p>
@@ -27558,6 +27098,7 @@
         <w:tc>
           <w:tcPr>
             <w:tcW w:w="0" w:type="auto"/>
+            <w:vMerge/>
             <w:hideMark/>
           </w:tcPr>
           <w:p>
@@ -27699,6 +27240,7 @@
         <w:tc>
           <w:tcPr>
             <w:tcW w:w="0" w:type="auto"/>
+            <w:vMerge/>
             <w:hideMark/>
           </w:tcPr>
           <w:p>
@@ -27840,6 +27382,7 @@
         <w:tc>
           <w:tcPr>
             <w:tcW w:w="0" w:type="auto"/>
+            <w:vMerge/>
             <w:hideMark/>
           </w:tcPr>
           <w:p>
@@ -27983,6 +27526,38 @@
           <w:lang w:val="en-US"/>
         </w:rPr>
       </w:pPr>
+    </w:p>
+    <w:p>
+      <w:pPr>
+        <w:jc w:val="both"/>
+        <w:rPr>
+          <w:rFonts w:ascii="Times New Roman" w:hAnsi="Times New Roman" w:cs="Times New Roman"/>
+          <w:lang w:val="en-US"/>
+        </w:rPr>
+      </w:pPr>
+      <w:r>
+        <w:rPr>
+          <w:rFonts w:ascii="Times New Roman" w:hAnsi="Times New Roman" w:cs="Times New Roman"/>
+          <w:lang w:val="en-US"/>
+        </w:rPr>
+        <w:t xml:space="preserve">For the baseline comparison, VNS uses </w:t>
+      </w:r>
+      <w:proofErr w:type="gramStart"/>
+      <w:r>
+        <w:rPr>
+          <w:rFonts w:ascii="Times New Roman" w:hAnsi="Times New Roman" w:cs="Times New Roman"/>
+          <w:lang w:val="en-US"/>
+        </w:rPr>
+        <w:t>relocate</w:t>
+      </w:r>
+      <w:proofErr w:type="gramEnd"/>
+      <w:r>
+        <w:rPr>
+          <w:rFonts w:ascii="Times New Roman" w:hAnsi="Times New Roman" w:cs="Times New Roman"/>
+          <w:lang w:val="en-US"/>
+        </w:rPr>
+        <w:t>, swap, and intra-route 2-opt neighborhoods, with three neighborhood levels and 12 attempts per neighborhood. SA uses an initial temperature of 200, a cooling factor of 0.995, and a minimum temperature of 0.5. ALNS-FR and ALNS-PR use a destroy size of 4–12 customers, adaptive operator weights updated every 20 iterations with scores 33/9/5, and a cooling factor of 0.9995. All stochastic methods are run five times with a 30 s search budget.</w:t>
+      </w:r>
     </w:p>
     <w:p>
       <w:pPr>
@@ -28280,7 +27855,6 @@
           <w:rFonts w:ascii="Times New Roman" w:hAnsi="Times New Roman" w:cs="Times New Roman"/>
           <w:lang w:val="en-US"/>
         </w:rPr>
-        <w:lastRenderedPageBreak/>
         <w:t>Figure 2 presents the paired instance-level effects across the two time-window regimes. The results show that partial recharging consistently avoids unnecessary charging activity</w:t>
       </w:r>
       <w:r>
@@ -28300,6 +27874,11 @@
     </w:p>
     <w:p>
       <w:pPr>
+        <w:pStyle w:val="Paragraphedeliste"/>
+        <w:numPr>
+          <w:ilvl w:val="1"/>
+          <w:numId w:val="25"/>
+        </w:numPr>
         <w:jc w:val="both"/>
         <w:rPr>
           <w:rFonts w:ascii="Times New Roman" w:hAnsi="Times New Roman" w:cs="Times New Roman"/>
@@ -28335,6 +27914,7 @@
           <w:rFonts w:ascii="Times New Roman" w:hAnsi="Times New Roman" w:cs="Times New Roman"/>
           <w:lang w:val="en-US"/>
         </w:rPr>
+        <w:lastRenderedPageBreak/>
         <w:t xml:space="preserve">The charging-aware analysis uses the common </w:t>
       </w:r>
       <m:oMath>
@@ -28373,6 +27953,13 @@
           </m:sup>
         </m:sSubSup>
       </m:oMath>
+      <w:r>
+        <w:rPr>
+          <w:rFonts w:ascii="Times New Roman" w:eastAsiaTheme="minorEastAsia" w:hAnsi="Times New Roman" w:cs="Times New Roman"/>
+          <w:lang w:val="en-US"/>
+        </w:rPr>
+        <w:t xml:space="preserve"> </w:t>
+      </w:r>
       <w:r>
         <w:rPr>
           <w:rFonts w:ascii="Times New Roman" w:hAnsi="Times New Roman" w:cs="Times New Roman"/>
@@ -29374,6 +28961,7 @@
           <w:rFonts w:ascii="Times New Roman" w:hAnsi="Times New Roman" w:cs="Times New Roman"/>
           <w:lang w:val="en-US"/>
         </w:rPr>
+        <w:lastRenderedPageBreak/>
         <w:t xml:space="preserve">These gains are not uniform across the benchmark. For charging </w:t>
       </w:r>
       <w:proofErr w:type="gramStart"/>
@@ -29634,6 +29222,11 @@
     </w:p>
     <w:p>
       <w:pPr>
+        <w:pStyle w:val="Paragraphedeliste"/>
+        <w:numPr>
+          <w:ilvl w:val="1"/>
+          <w:numId w:val="25"/>
+        </w:numPr>
         <w:jc w:val="both"/>
         <w:rPr>
           <w:rFonts w:ascii="Times New Roman" w:hAnsi="Times New Roman" w:cs="Times New Roman"/>
@@ -31047,6 +30640,11 @@
     </w:p>
     <w:p>
       <w:pPr>
+        <w:pStyle w:val="Paragraphedeliste"/>
+        <w:numPr>
+          <w:ilvl w:val="0"/>
+          <w:numId w:val="25"/>
+        </w:numPr>
         <w:jc w:val="both"/>
         <w:rPr>
           <w:rFonts w:ascii="Times New Roman" w:hAnsi="Times New Roman" w:cs="Times New Roman"/>
@@ -31153,6 +30751,11 @@
     </w:p>
     <w:p>
       <w:pPr>
+        <w:pStyle w:val="Paragraphedeliste"/>
+        <w:numPr>
+          <w:ilvl w:val="0"/>
+          <w:numId w:val="25"/>
+        </w:numPr>
         <w:jc w:val="both"/>
         <w:rPr>
           <w:rFonts w:ascii="Times New Roman" w:hAnsi="Times New Roman" w:cs="Times New Roman"/>
@@ -34099,6 +33702,127 @@
     </w:lvl>
   </w:abstractNum>
   <w:abstractNum w:abstractNumId="13" w15:restartNumberingAfterBreak="0">
+    <w:nsid w:val="50AC163F"/>
+    <w:multiLevelType w:val="multilevel"/>
+    <w:tmpl w:val="048483C2"/>
+    <w:lvl w:ilvl="0">
+      <w:start w:val="1"/>
+      <w:numFmt w:val="decimal"/>
+      <w:lvlText w:val="%1."/>
+      <w:lvlJc w:val="left"/>
+      <w:pPr>
+        <w:ind w:left="720" w:hanging="360"/>
+      </w:pPr>
+      <w:rPr>
+        <w:rFonts w:hint="default"/>
+      </w:rPr>
+    </w:lvl>
+    <w:lvl w:ilvl="1">
+      <w:start w:val="1"/>
+      <w:numFmt w:val="decimal"/>
+      <w:isLgl/>
+      <w:lvlText w:val="%1.%2."/>
+      <w:lvlJc w:val="left"/>
+      <w:pPr>
+        <w:ind w:left="720" w:hanging="360"/>
+      </w:pPr>
+      <w:rPr>
+        <w:rFonts w:hint="default"/>
+      </w:rPr>
+    </w:lvl>
+    <w:lvl w:ilvl="2">
+      <w:start w:val="1"/>
+      <w:numFmt w:val="decimal"/>
+      <w:isLgl/>
+      <w:lvlText w:val="%1.%2.%3."/>
+      <w:lvlJc w:val="left"/>
+      <w:pPr>
+        <w:ind w:left="1080" w:hanging="720"/>
+      </w:pPr>
+      <w:rPr>
+        <w:rFonts w:hint="default"/>
+      </w:rPr>
+    </w:lvl>
+    <w:lvl w:ilvl="3">
+      <w:start w:val="1"/>
+      <w:numFmt w:val="decimal"/>
+      <w:isLgl/>
+      <w:lvlText w:val="%1.%2.%3.%4."/>
+      <w:lvlJc w:val="left"/>
+      <w:pPr>
+        <w:ind w:left="1080" w:hanging="720"/>
+      </w:pPr>
+      <w:rPr>
+        <w:rFonts w:hint="default"/>
+      </w:rPr>
+    </w:lvl>
+    <w:lvl w:ilvl="4">
+      <w:start w:val="1"/>
+      <w:numFmt w:val="decimal"/>
+      <w:isLgl/>
+      <w:lvlText w:val="%1.%2.%3.%4.%5."/>
+      <w:lvlJc w:val="left"/>
+      <w:pPr>
+        <w:ind w:left="1440" w:hanging="1080"/>
+      </w:pPr>
+      <w:rPr>
+        <w:rFonts w:hint="default"/>
+      </w:rPr>
+    </w:lvl>
+    <w:lvl w:ilvl="5">
+      <w:start w:val="1"/>
+      <w:numFmt w:val="decimal"/>
+      <w:isLgl/>
+      <w:lvlText w:val="%1.%2.%3.%4.%5.%6."/>
+      <w:lvlJc w:val="left"/>
+      <w:pPr>
+        <w:ind w:left="1440" w:hanging="1080"/>
+      </w:pPr>
+      <w:rPr>
+        <w:rFonts w:hint="default"/>
+      </w:rPr>
+    </w:lvl>
+    <w:lvl w:ilvl="6">
+      <w:start w:val="1"/>
+      <w:numFmt w:val="decimal"/>
+      <w:isLgl/>
+      <w:lvlText w:val="%1.%2.%3.%4.%5.%6.%7."/>
+      <w:lvlJc w:val="left"/>
+      <w:pPr>
+        <w:ind w:left="1800" w:hanging="1440"/>
+      </w:pPr>
+      <w:rPr>
+        <w:rFonts w:hint="default"/>
+      </w:rPr>
+    </w:lvl>
+    <w:lvl w:ilvl="7">
+      <w:start w:val="1"/>
+      <w:numFmt w:val="decimal"/>
+      <w:isLgl/>
+      <w:lvlText w:val="%1.%2.%3.%4.%5.%6.%7.%8."/>
+      <w:lvlJc w:val="left"/>
+      <w:pPr>
+        <w:ind w:left="1800" w:hanging="1440"/>
+      </w:pPr>
+      <w:rPr>
+        <w:rFonts w:hint="default"/>
+      </w:rPr>
+    </w:lvl>
+    <w:lvl w:ilvl="8">
+      <w:start w:val="1"/>
+      <w:numFmt w:val="decimal"/>
+      <w:isLgl/>
+      <w:lvlText w:val="%1.%2.%3.%4.%5.%6.%7.%8.%9."/>
+      <w:lvlJc w:val="left"/>
+      <w:pPr>
+        <w:ind w:left="2160" w:hanging="1800"/>
+      </w:pPr>
+      <w:rPr>
+        <w:rFonts w:hint="default"/>
+      </w:rPr>
+    </w:lvl>
+  </w:abstractNum>
+  <w:abstractNum w:abstractNumId="14" w15:restartNumberingAfterBreak="0">
     <w:nsid w:val="50C86197"/>
     <w:multiLevelType w:val="multilevel"/>
     <w:tmpl w:val="494C65D4"/>
@@ -34211,7 +33935,7 @@
       </w:pPr>
     </w:lvl>
   </w:abstractNum>
-  <w:abstractNum w:abstractNumId="14" w15:restartNumberingAfterBreak="0">
+  <w:abstractNum w:abstractNumId="15" w15:restartNumberingAfterBreak="0">
     <w:nsid w:val="5BE23C2C"/>
     <w:multiLevelType w:val="multilevel"/>
     <w:tmpl w:val="1068C2EE"/>
@@ -34324,7 +34048,7 @@
       </w:pPr>
     </w:lvl>
   </w:abstractNum>
-  <w:abstractNum w:abstractNumId="15" w15:restartNumberingAfterBreak="0">
+  <w:abstractNum w:abstractNumId="16" w15:restartNumberingAfterBreak="0">
     <w:nsid w:val="5C2B2AAB"/>
     <w:multiLevelType w:val="multilevel"/>
     <w:tmpl w:val="1068C2EE"/>
@@ -34437,7 +34161,7 @@
       </w:pPr>
     </w:lvl>
   </w:abstractNum>
-  <w:abstractNum w:abstractNumId="16" w15:restartNumberingAfterBreak="0">
+  <w:abstractNum w:abstractNumId="17" w15:restartNumberingAfterBreak="0">
     <w:nsid w:val="5D4269AE"/>
     <w:multiLevelType w:val="multilevel"/>
     <w:tmpl w:val="31ECB71E"/>
@@ -34550,7 +34274,7 @@
       </w:pPr>
     </w:lvl>
   </w:abstractNum>
-  <w:abstractNum w:abstractNumId="17" w15:restartNumberingAfterBreak="0">
+  <w:abstractNum w:abstractNumId="18" w15:restartNumberingAfterBreak="0">
     <w:nsid w:val="5D862A41"/>
     <w:multiLevelType w:val="multilevel"/>
     <w:tmpl w:val="73C27C1C"/>
@@ -34663,7 +34387,7 @@
       </w:pPr>
     </w:lvl>
   </w:abstractNum>
-  <w:abstractNum w:abstractNumId="18" w15:restartNumberingAfterBreak="0">
+  <w:abstractNum w:abstractNumId="19" w15:restartNumberingAfterBreak="0">
     <w:nsid w:val="610A1030"/>
     <w:multiLevelType w:val="multilevel"/>
     <w:tmpl w:val="1068C2EE"/>
@@ -34776,7 +34500,7 @@
       </w:pPr>
     </w:lvl>
   </w:abstractNum>
-  <w:abstractNum w:abstractNumId="19" w15:restartNumberingAfterBreak="0">
+  <w:abstractNum w:abstractNumId="20" w15:restartNumberingAfterBreak="0">
     <w:nsid w:val="70EC59FC"/>
     <w:multiLevelType w:val="multilevel"/>
     <w:tmpl w:val="1068C2EE"/>
@@ -34889,7 +34613,7 @@
       </w:pPr>
     </w:lvl>
   </w:abstractNum>
-  <w:abstractNum w:abstractNumId="20" w15:restartNumberingAfterBreak="0">
+  <w:abstractNum w:abstractNumId="21" w15:restartNumberingAfterBreak="0">
     <w:nsid w:val="76B41923"/>
     <w:multiLevelType w:val="multilevel"/>
     <w:tmpl w:val="1068C2EE"/>
@@ -35002,7 +34726,7 @@
       </w:pPr>
     </w:lvl>
   </w:abstractNum>
-  <w:abstractNum w:abstractNumId="21" w15:restartNumberingAfterBreak="0">
+  <w:abstractNum w:abstractNumId="22" w15:restartNumberingAfterBreak="0">
     <w:nsid w:val="7B110302"/>
     <w:multiLevelType w:val="multilevel"/>
     <w:tmpl w:val="31ECB71E"/>
@@ -35115,7 +34839,7 @@
       </w:pPr>
     </w:lvl>
   </w:abstractNum>
-  <w:abstractNum w:abstractNumId="22" w15:restartNumberingAfterBreak="0">
+  <w:abstractNum w:abstractNumId="23" w15:restartNumberingAfterBreak="0">
     <w:nsid w:val="7C8140C5"/>
     <w:multiLevelType w:val="multilevel"/>
     <w:tmpl w:val="1068C2EE"/>
@@ -35228,7 +34952,7 @@
       </w:pPr>
     </w:lvl>
   </w:abstractNum>
-  <w:abstractNum w:abstractNumId="23" w15:restartNumberingAfterBreak="0">
+  <w:abstractNum w:abstractNumId="24" w15:restartNumberingAfterBreak="0">
     <w:nsid w:val="7DF21145"/>
     <w:multiLevelType w:val="multilevel"/>
     <w:tmpl w:val="31ECB71E"/>
@@ -35345,7 +35069,7 @@
     <w:abstractNumId w:val="5"/>
   </w:num>
   <w:num w:numId="2" w16cid:durableId="1775126473">
-    <w:abstractNumId w:val="17"/>
+    <w:abstractNumId w:val="18"/>
   </w:num>
   <w:num w:numId="3" w16cid:durableId="1626622390">
     <w:abstractNumId w:val="0"/>
@@ -35354,10 +35078,10 @@
     <w:abstractNumId w:val="4"/>
   </w:num>
   <w:num w:numId="5" w16cid:durableId="1598102897">
-    <w:abstractNumId w:val="20"/>
+    <w:abstractNumId w:val="21"/>
   </w:num>
   <w:num w:numId="6" w16cid:durableId="738944884">
-    <w:abstractNumId w:val="18"/>
+    <w:abstractNumId w:val="19"/>
   </w:num>
   <w:num w:numId="7" w16cid:durableId="666179344">
     <w:abstractNumId w:val="3"/>
@@ -35372,25 +35096,25 @@
     <w:abstractNumId w:val="1"/>
   </w:num>
   <w:num w:numId="11" w16cid:durableId="254942076">
-    <w:abstractNumId w:val="22"/>
+    <w:abstractNumId w:val="23"/>
   </w:num>
   <w:num w:numId="12" w16cid:durableId="702823755">
-    <w:abstractNumId w:val="14"/>
+    <w:abstractNumId w:val="15"/>
   </w:num>
   <w:num w:numId="13" w16cid:durableId="1144934986">
     <w:abstractNumId w:val="9"/>
   </w:num>
   <w:num w:numId="14" w16cid:durableId="1908372422">
-    <w:abstractNumId w:val="19"/>
+    <w:abstractNumId w:val="20"/>
   </w:num>
   <w:num w:numId="15" w16cid:durableId="668874721">
-    <w:abstractNumId w:val="15"/>
+    <w:abstractNumId w:val="16"/>
   </w:num>
   <w:num w:numId="16" w16cid:durableId="734204352">
     <w:abstractNumId w:val="6"/>
   </w:num>
   <w:num w:numId="17" w16cid:durableId="1728530153">
-    <w:abstractNumId w:val="13"/>
+    <w:abstractNumId w:val="14"/>
   </w:num>
   <w:num w:numId="18" w16cid:durableId="360277255">
     <w:abstractNumId w:val="11"/>
@@ -35402,16 +35126,19 @@
     <w:abstractNumId w:val="8"/>
   </w:num>
   <w:num w:numId="21" w16cid:durableId="1255478395">
-    <w:abstractNumId w:val="21"/>
+    <w:abstractNumId w:val="22"/>
   </w:num>
   <w:num w:numId="22" w16cid:durableId="1805661505">
     <w:abstractNumId w:val="7"/>
   </w:num>
   <w:num w:numId="23" w16cid:durableId="168834056">
-    <w:abstractNumId w:val="16"/>
+    <w:abstractNumId w:val="17"/>
   </w:num>
   <w:num w:numId="24" w16cid:durableId="952783492">
-    <w:abstractNumId w:val="23"/>
+    <w:abstractNumId w:val="24"/>
+  </w:num>
+  <w:num w:numId="25" w16cid:durableId="1502969694">
+    <w:abstractNumId w:val="13"/>
   </w:num>
 </w:numbering>
 </file>
@@ -36020,7 +35747,6 @@
   <w:style w:type="character" w:default="1" w:styleId="Policepardfaut">
     <w:name w:val="Default Paragraph Font"/>
     <w:uiPriority w:val="1"/>
-    <w:semiHidden/>
     <w:unhideWhenUsed/>
   </w:style>
   <w:style w:type="table" w:default="1" w:styleId="TableauNormal">

</xml_diff>